<commit_message>
docs(walkthrough): add v2.4 reservation-model plain-English section (CAP-020..024/PLC-011/OPS-006)
</commit_message>
<xml_diff>
--- a/docs/reference/acrme_plain_english_walkthrough.docx
+++ b/docs/reference/acrme_plain_english_walkthrough.docx
@@ -2,13 +2,13 @@
 <file path=word/document.xml><?xml version="1.0" encoding="utf-8"?>
 <w:document xmlns:w="http://schemas.openxmlformats.org/wordprocessingml/2006/main" xmlns:m="http://schemas.openxmlformats.org/officeDocument/2006/math" xmlns:r="http://schemas.openxmlformats.org/officeDocument/2006/relationships" xmlns:o="urn:schemas-microsoft-com:office:office" xmlns:v="urn:schemas-microsoft-com:vml" xmlns:w10="urn:schemas-microsoft-com:office:word" xmlns:a="http://schemas.openxmlformats.org/drawingml/2006/main" xmlns:pic="http://schemas.openxmlformats.org/drawingml/2006/picture" xmlns:wp="http://schemas.openxmlformats.org/drawingml/2006/wordprocessingDrawing">
   <w:body>
-    <w:bookmarkStart w:id="97" w:name="Xd2574ea027b0a220e9963f5fb01075e47dd758e"/>
+    <w:bookmarkStart w:id="104" w:name="X0503d82aad010b29295d66423400487ca63fe23"/>
     <w:p>
       <w:pPr>
         <w:pStyle w:val="Heading1"/>
       </w:pPr>
       <w:r>
-        <w:t xml:space="preserve">ACRME Calculation Logic — Plain English Walkthrough (v2.2)</w:t>
+        <w:t xml:space="preserve">ACRME Calculation Logic — Plain English Walkthrough (v2.4)</w:t>
       </w:r>
     </w:p>
     <w:p>
@@ -32,7 +32,7 @@
         <w:t xml:space="preserve"> </w:t>
       </w:r>
       <w:r>
-        <w:t xml:space="preserve">Calculation Logic Reference (v2.2). This document does</w:t>
+        <w:t xml:space="preserve">Calculation Logic Reference. This document does</w:t>
       </w:r>
       <w:r>
         <w:t xml:space="preserve"> </w:t>
@@ -112,7 +112,136 @@
         <w:t xml:space="preserve"> </w:t>
       </w:r>
       <w:r>
-        <w:t xml:space="preserve">1.0 — 2 September 2026. Authored from the ACRME Q&amp;A design walkthrough session.</w:t>
+        <w:t xml:space="preserve">1.1 — reconciled to Requirements Baseline</w:t>
+      </w:r>
+      <w:r>
+        <w:t xml:space="preserve"> </w:t>
+      </w:r>
+      <w:r>
+        <w:rPr>
+          <w:bCs/>
+          <w:b/>
+        </w:rPr>
+        <w:t xml:space="preserve">v2.4</w:t>
+      </w:r>
+      <w:r>
+        <w:t xml:space="preserve"> </w:t>
+      </w:r>
+      <w:r>
+        <w:t xml:space="preserve">(7 September 2026); originally authored 2 September 2026 from the ACRME Q&amp;A design walkthrough session.</w:t>
+      </w:r>
+    </w:p>
+    <w:p>
+      <w:pPr>
+        <w:pStyle w:val="BlockText"/>
+      </w:pPr>
+      <w:r>
+        <w:rPr>
+          <w:bCs/>
+          <w:b/>
+        </w:rPr>
+        <w:t xml:space="preserve">v2.4 reconciliation note.</w:t>
+      </w:r>
+      <w:r>
+        <w:t xml:space="preserve"> </w:t>
+      </w:r>
+      <w:r>
+        <w:t xml:space="preserve">The geography-aware region model (US three-region; EU/Australia/Asia Pacific/Middle East two-region with CVAL+DR co-located per PLC-010a; Middle East</w:t>
+      </w:r>
+      <w:r>
+        <w:t xml:space="preserve"> </w:t>
+      </w:r>
+      <w:r>
+        <w:rPr>
+          <w:rStyle w:val="VerbatimChar"/>
+        </w:rPr>
+        <w:t xml:space="preserve">DR_NOT_OFFERED</w:t>
+      </w:r>
+      <w:r>
+        <w:t xml:space="preserve"> </w:t>
+      </w:r>
+      <w:r>
+        <w:t xml:space="preserve">per DEC-001) is unchanged and already reflected below. v2.4 adds the reservation-model concepts folded from the architecture diagrams — reservation</w:t>
+      </w:r>
+      <w:r>
+        <w:t xml:space="preserve"> </w:t>
+      </w:r>
+      <w:r>
+        <w:rPr>
+          <w:bCs/>
+          <w:b/>
+        </w:rPr>
+        <w:t xml:space="preserve">eligibility</w:t>
+      </w:r>
+      <w:r>
+        <w:t xml:space="preserve"> </w:t>
+      </w:r>
+      <w:r>
+        <w:t xml:space="preserve">(CAP-020/CAP-021), the</w:t>
+      </w:r>
+      <w:r>
+        <w:t xml:space="preserve"> </w:t>
+      </w:r>
+      <w:r>
+        <w:rPr>
+          <w:bCs/>
+          <w:b/>
+        </w:rPr>
+        <w:t xml:space="preserve">seed-at-0</w:t>
+      </w:r>
+      <w:r>
+        <w:t xml:space="preserve"> </w:t>
+      </w:r>
+      <w:r>
+        <w:t xml:space="preserve">SKU/AZ matrix (CAP-022), the explicit</w:t>
+      </w:r>
+      <w:r>
+        <w:t xml:space="preserve"> </w:t>
+      </w:r>
+      <w:r>
+        <w:rPr>
+          <w:bCs/>
+          <w:b/>
+        </w:rPr>
+        <w:t xml:space="preserve">regional + per-AZ CRG</w:t>
+      </w:r>
+      <w:r>
+        <w:t xml:space="preserve"> </w:t>
+      </w:r>
+      <w:r>
+        <w:t xml:space="preserve">structure (CAP-023),</w:t>
+      </w:r>
+      <w:r>
+        <w:t xml:space="preserve"> </w:t>
+      </w:r>
+      <w:r>
+        <w:rPr>
+          <w:bCs/>
+          <w:b/>
+        </w:rPr>
+        <w:t xml:space="preserve">reactive SKU/AZ discovery</w:t>
+      </w:r>
+      <w:r>
+        <w:t xml:space="preserve"> </w:t>
+      </w:r>
+      <w:r>
+        <w:t xml:space="preserve">(CAP-024), and the</w:t>
+      </w:r>
+      <w:r>
+        <w:t xml:space="preserve"> </w:t>
+      </w:r>
+      <w:r>
+        <w:rPr>
+          <w:bCs/>
+          <w:b/>
+        </w:rPr>
+        <w:t xml:space="preserve">even zone-distribution</w:t>
+      </w:r>
+      <w:r>
+        <w:t xml:space="preserve"> </w:t>
+      </w:r>
+      <w:r>
+        <w:t xml:space="preserve">target + rebalancing (PLC-011, Appendix A.9). These are explained in plain language in the new Section 5.11.</w:t>
       </w:r>
     </w:p>
     <w:p>
@@ -225,7 +354,7 @@
               <w:jc w:val="left"/>
             </w:pPr>
             <w:r>
-              <w:t xml:space="preserve">1.0</w:t>
+              <w:t xml:space="preserve">1.1 (reconciled to Requirements Baseline v2.4)</w:t>
             </w:r>
           </w:p>
         </w:tc>
@@ -285,7 +414,7 @@
               <w:jc w:val="left"/>
             </w:pPr>
             <w:r>
-              <w:t xml:space="preserve">2 September 2026</w:t>
+              <w:t xml:space="preserve">7 September 2026 (originally 2 September 2026)</w:t>
             </w:r>
           </w:p>
         </w:tc>
@@ -315,7 +444,7 @@
               <w:jc w:val="left"/>
             </w:pPr>
             <w:r>
-              <w:t xml:space="preserve">ACRME Q&amp;A design walkthrough session; Calculation Logic Reference v2.2; Requirements Baseline v2.2</w:t>
+              <w:t xml:space="preserve">ACRME Q&amp;A design walkthrough session; Calculation Logic Reference; Requirements Baseline v2.4</w:t>
             </w:r>
           </w:p>
         </w:tc>
@@ -1107,7 +1236,7 @@
         <w:t xml:space="preserve"> </w:t>
       </w:r>
       <w:r>
-        <w:t xml:space="preserve">v2.3 Section 6, ADR-001).</w:t>
+        <w:t xml:space="preserve">v2.4 Section 6, ADR-001).</w:t>
       </w:r>
       <w:r>
         <w:t xml:space="preserve"> </w:t>
@@ -12043,7 +12172,7 @@
     </w:p>
     <w:bookmarkEnd w:id="65"/>
     <w:bookmarkEnd w:id="66"/>
-    <w:bookmarkStart w:id="79" w:name="domain-3-capacity-management"/>
+    <w:bookmarkStart w:id="86" w:name="domain-3-capacity-management"/>
     <w:p>
       <w:pPr>
         <w:pStyle w:val="Heading2"/>
@@ -14605,23 +14734,13 @@
       </w:r>
     </w:p>
     <w:bookmarkEnd w:id="78"/>
-    <w:bookmarkEnd w:id="79"/>
-    <w:bookmarkStart w:id="85" w:name="scoring-weight-invariant"/>
-    <w:p>
-      <w:pPr>
-        <w:pStyle w:val="Heading2"/>
-      </w:pPr>
-      <w:r>
-        <w:t xml:space="preserve">6. Scoring Weight Invariant</w:t>
-      </w:r>
-    </w:p>
-    <w:bookmarkStart w:id="80" w:name="the-rule"/>
+    <w:bookmarkStart w:id="85" w:name="X173fe9dde77789ebc3cc89293969d02d2a3558a"/>
     <w:p>
       <w:pPr>
         <w:pStyle w:val="Heading3"/>
       </w:pPr>
       <w:r>
-        <w:t xml:space="preserve">6.1 The Rule</w:t>
+        <w:t xml:space="preserve">5.11 v2.4 Reservation-Model Additions (Plain English)</w:t>
       </w:r>
     </w:p>
     <w:p>
@@ -14629,31 +14748,28 @@
         <w:pStyle w:val="FirstParagraph"/>
       </w:pPr>
       <w:r>
-        <w:rPr>
-          <w:bCs/>
-          <w:b/>
-        </w:rPr>
-        <w:t xml:space="preserve">The five placement scoring weights must always sum to exactly 1.0:</w:t>
-      </w:r>
-    </w:p>
-    <w:p>
-      <w:pPr>
-        <w:pStyle w:val="SourceCode"/>
-      </w:pPr>
-      <w:r>
-        <w:rPr>
-          <w:rStyle w:val="VerbatimChar"/>
-        </w:rPr>
-        <w:t xml:space="preserve">α + β + γ + δ + ε = 1.0</w:t>
-      </w:r>
-      <w:r>
-        <w:br/>
-      </w:r>
-      <w:r>
-        <w:rPr>
-          <w:rStyle w:val="VerbatimChar"/>
-        </w:rPr>
-        <w:t xml:space="preserve">0.30 + 0.20 + 0.25 + 0.15 + 0.10 = 1.00 ✓</w:t>
+        <w:t xml:space="preserve">Requirements Baseline v2.4 folded the reservation-model detail from the reviewed architecture</w:t>
+      </w:r>
+      <w:r>
+        <w:t xml:space="preserve"> </w:t>
+      </w:r>
+      <w:r>
+        <w:t xml:space="preserve">diagrams (Reservation Model, Reservation Creation, Reservation Decommissioning) into the baseline.</w:t>
+      </w:r>
+      <w:r>
+        <w:t xml:space="preserve"> </w:t>
+      </w:r>
+      <w:r>
+        <w:t xml:space="preserve">Nothing above changes; the following concepts are added.</w:t>
+      </w:r>
+    </w:p>
+    <w:bookmarkStart w:id="79" w:name="X7499f2695a2ece7cabce3d0d0c1831fe14a6893"/>
+    <w:p>
+      <w:pPr>
+        <w:pStyle w:val="Heading4"/>
+      </w:pPr>
+      <w:r>
+        <w:t xml:space="preserve">5.11.1 Which VMs can even have a reservation? (CAP-020, CAP-021)</w:t>
       </w:r>
     </w:p>
     <w:p>
@@ -14661,25 +14777,7 @@
         <w:pStyle w:val="FirstParagraph"/>
       </w:pPr>
       <w:r>
-        <w:t xml:space="preserve">This is not a convention. It is a mathematical requirement for the scores to be meaningful.</w:t>
-      </w:r>
-    </w:p>
-    <w:bookmarkEnd w:id="80"/>
-    <w:bookmarkStart w:id="81" w:name="why-1.0-is-required"/>
-    <w:p>
-      <w:pPr>
-        <w:pStyle w:val="Heading3"/>
-      </w:pPr>
-      <w:r>
-        <w:t xml:space="preserve">6.2 Why 1.0 Is Required</w:t>
-      </w:r>
-    </w:p>
-    <w:p>
-      <w:pPr>
-        <w:pStyle w:val="FirstParagraph"/>
-      </w:pPr>
-      <w:r>
-        <w:t xml:space="preserve">Every component is clamped to [0, 1]. When weights sum to exactly 1.0:</w:t>
+        <w:t xml:space="preserve">Not every VM is eligible for a capacity reservation:</w:t>
       </w:r>
     </w:p>
     <w:p>
@@ -14691,36 +14789,67 @@
         <w:pStyle w:val="Compact"/>
       </w:pPr>
       <w:r>
-        <w:t xml:space="preserve">The</w:t>
-      </w:r>
-      <w:r>
-        <w:t xml:space="preserve"> </w:t>
-      </w:r>
-      <w:r>
-        <w:rPr>
-          <w:bCs/>
-          <w:b/>
-        </w:rPr>
-        <w:t xml:space="preserve">best possible region</w:t>
-      </w:r>
-      <w:r>
-        <w:t xml:space="preserve"> </w:t>
-      </w:r>
-      <w:r>
-        <w:t xml:space="preserve">(all components = 1.0) scores exactly</w:t>
-      </w:r>
-      <w:r>
-        <w:t xml:space="preserve"> </w:t>
-      </w:r>
-      <w:r>
-        <w:rPr>
-          <w:bCs/>
-          <w:b/>
-        </w:rPr>
-        <w:t xml:space="preserve">1.0</w:t>
-      </w:r>
-      <w:r>
-        <w:t xml:space="preserve">.</w:t>
+        <w:rPr>
+          <w:bCs/>
+          <w:b/>
+        </w:rPr>
+        <w:t xml:space="preserve">Availability-Set VMs are ineligible (CAP-020).</w:t>
+      </w:r>
+      <w:r>
+        <w:t xml:space="preserve"> </w:t>
+      </w:r>
+      <w:r>
+        <w:t xml:space="preserve">A VM deployed into an Azure</w:t>
+      </w:r>
+      <w:r>
+        <w:t xml:space="preserve"> </w:t>
+      </w:r>
+      <w:r>
+        <w:rPr>
+          <w:bCs/>
+          <w:b/>
+        </w:rPr>
+        <w:t xml:space="preserve">Availability Set</w:t>
+      </w:r>
+      <w:r>
+        <w:t xml:space="preserve"> </w:t>
+      </w:r>
+      <w:r>
+        <w:t xml:space="preserve">cannot be backed by a capacity reservation. Capacity reservations are an</w:t>
+      </w:r>
+      <w:r>
+        <w:t xml:space="preserve"> </w:t>
+      </w:r>
+      <w:r>
+        <w:rPr>
+          <w:bCs/>
+          <w:b/>
+        </w:rPr>
+        <w:t xml:space="preserve">availability-zone</w:t>
+      </w:r>
+      <w:r>
+        <w:t xml:space="preserve"> </w:t>
+      </w:r>
+      <w:r>
+        <w:t xml:space="preserve">concept; Availability Sets are the older, non-zonal placement model, and Azure does not let the two</w:t>
+      </w:r>
+    </w:p>
+    <w:p>
+      <w:pPr>
+        <w:numPr>
+          <w:ilvl w:val="1"/>
+          <w:numId w:val="1015"/>
+        </w:numPr>
+        <w:pStyle w:val="Compact"/>
+      </w:pPr>
+      <w:r>
+        <w:t xml:space="preserve">In plain terms: if a workload is in an Availability Set, ACRME will not try to reserve capacity</w:t>
+      </w:r>
+      <w:r>
+        <w:t xml:space="preserve"> </w:t>
+      </w:r>
+      <w:r>
+        <w:t xml:space="preserve">for it — it flags it as ineligible with the reason recorded.</w:t>
       </w:r>
     </w:p>
     <w:p>
@@ -14732,102 +14861,92 @@
         <w:pStyle w:val="Compact"/>
       </w:pPr>
       <w:r>
-        <w:t xml:space="preserve">The</w:t>
-      </w:r>
-      <w:r>
-        <w:t xml:space="preserve"> </w:t>
-      </w:r>
-      <w:r>
-        <w:rPr>
-          <w:bCs/>
-          <w:b/>
-        </w:rPr>
-        <w:t xml:space="preserve">worst possible region</w:t>
-      </w:r>
-      <w:r>
-        <w:t xml:space="preserve"> </w:t>
-      </w:r>
-      <w:r>
-        <w:t xml:space="preserve">(all components = 0.0) scores exactly</w:t>
-      </w:r>
-      <w:r>
-        <w:t xml:space="preserve"> </w:t>
-      </w:r>
-      <w:r>
-        <w:rPr>
-          <w:bCs/>
-          <w:b/>
-        </w:rPr>
-        <w:t xml:space="preserve">0.0</w:t>
-      </w:r>
-      <w:r>
-        <w:t xml:space="preserve">.</w:t>
-      </w:r>
-    </w:p>
-    <w:p>
-      <w:pPr>
-        <w:numPr>
-          <w:ilvl w:val="0"/>
-          <w:numId w:val="1014"/>
-        </w:numPr>
-        <w:pStyle w:val="Compact"/>
-      </w:pPr>
-      <w:r>
-        <w:t xml:space="preserve">Every real region scores</w:t>
-      </w:r>
-      <w:r>
-        <w:t xml:space="preserve"> </w:t>
-      </w:r>
-      <w:r>
-        <w:rPr>
-          <w:bCs/>
-          <w:b/>
-        </w:rPr>
-        <w:t xml:space="preserve">somewhere between 0 and 1</w:t>
-      </w:r>
-      <w:r>
-        <w:t xml:space="preserve">.</w:t>
-      </w:r>
-    </w:p>
-    <w:p>
-      <w:pPr>
-        <w:numPr>
-          <w:ilvl w:val="0"/>
-          <w:numId w:val="1014"/>
-        </w:numPr>
-        <w:pStyle w:val="Compact"/>
-      </w:pPr>
-      <w:r>
-        <w:t xml:space="preserve">Scores from different regions are</w:t>
-      </w:r>
-      <w:r>
-        <w:t xml:space="preserve"> </w:t>
-      </w:r>
-      <w:r>
-        <w:rPr>
-          <w:bCs/>
-          <w:b/>
-        </w:rPr>
-        <w:t xml:space="preserve">directly comparable</w:t>
-      </w:r>
-      <w:r>
-        <w:t xml:space="preserve">: 0.75 is always better than 0.60, in</w:t>
-      </w:r>
-      <w:r>
-        <w:t xml:space="preserve"> </w:t>
-      </w:r>
-      <w:r>
-        <w:t xml:space="preserve">every run, under every policy version.</w:t>
-      </w:r>
-    </w:p>
-    <w:bookmarkEnd w:id="81"/>
-    <w:bookmarkStart w:id="82" w:name="X4e64c371e360098977ce2c86b94bd959b08a421"/>
-    <w:p>
-      <w:pPr>
-        <w:pStyle w:val="Heading3"/>
-      </w:pPr>
-      <w:r>
-        <w:t xml:space="preserve">6.3 What Breaks When the Weights Don’t Sum to 1.0</w:t>
+        <w:rPr>
+          <w:bCs/>
+          <w:b/>
+        </w:rPr>
+        <w:t xml:space="preserve">Onboarding a running VM needs a deallocate-or-redeploy step first (CAP-021).</w:t>
+      </w:r>
+      <w:r>
+        <w:t xml:space="preserve"> </w:t>
+      </w:r>
+      <w:r>
+        <w:t xml:space="preserve">To bring an</w:t>
+      </w:r>
+      <w:r>
+        <w:t xml:space="preserve"> </w:t>
+      </w:r>
+      <w:r>
+        <w:t xml:space="preserve">existing running VM under the reservation model, it must first be placed into an availability zone.</w:t>
+      </w:r>
+      <w:r>
+        <w:t xml:space="preserve"> </w:t>
+      </w:r>
+      <w:r>
+        <w:t xml:space="preserve">That means either</w:t>
+      </w:r>
+      <w:r>
+        <w:t xml:space="preserve"> </w:t>
+      </w:r>
+      <w:r>
+        <w:rPr>
+          <w:bCs/>
+          <w:b/>
+        </w:rPr>
+        <w:t xml:space="preserve">deallocating</w:t>
+      </w:r>
+      <w:r>
+        <w:t xml:space="preserve"> </w:t>
+      </w:r>
+      <w:r>
+        <w:t xml:space="preserve">it and restarting it into a zone, or</w:t>
+      </w:r>
+      <w:r>
+        <w:t xml:space="preserve"> </w:t>
+      </w:r>
+      <w:r>
+        <w:rPr>
+          <w:bCs/>
+          <w:b/>
+        </w:rPr>
+        <w:t xml:space="preserve">redeploying</w:t>
+      </w:r>
+      <w:r>
+        <w:t xml:space="preserve"> </w:t>
+      </w:r>
+      <w:r>
+        <w:t xml:space="preserve">it to a</w:t>
+      </w:r>
+      <w:r>
+        <w:t xml:space="preserve"> </w:t>
+      </w:r>
+      <w:r>
+        <w:t xml:space="preserve">zone. ACRME treats this as an onboarding</w:t>
+      </w:r>
+      <w:r>
+        <w:t xml:space="preserve"> </w:t>
+      </w:r>
+      <w:r>
+        <w:rPr>
+          <w:bCs/>
+          <w:b/>
+        </w:rPr>
+        <w:t xml:space="preserve">precondition</w:t>
+      </w:r>
+      <w:r>
+        <w:t xml:space="preserve">: until the VM is zone-aligned, it cannot</w:t>
+      </w:r>
+      <w:r>
+        <w:t xml:space="preserve"> </w:t>
+      </w:r>
+      <w:r>
+        <w:t xml:space="preserve">join a per-AZ CRG. The engine records this precondition state so operators know exactly what step is</w:t>
+      </w:r>
+      <w:r>
+        <w:t xml:space="preserve"> </w:t>
+      </w:r>
+      <w:r>
+        <w:t xml:space="preserve">outstanding.</w:t>
       </w:r>
     </w:p>
     <w:p>
@@ -14835,25 +14954,132 @@
         <w:pStyle w:val="FirstParagraph"/>
       </w:pPr>
       <w:r>
-        <w:rPr>
-          <w:bCs/>
-          <w:b/>
-        </w:rPr>
-        <w:t xml:space="preserve">If weights sum to more than 1.0 (e.g., 1.10):</w:t>
-      </w:r>
-    </w:p>
-    <w:p>
-      <w:pPr>
-        <w:pStyle w:val="BodyText"/>
-      </w:pPr>
-      <w:r>
-        <w:t xml:space="preserve">The best possible score inflates above 1.0. A region with all perfect components scores 1.10 instead</w:t>
-      </w:r>
-      <w:r>
-        <w:t xml:space="preserve"> </w:t>
-      </w:r>
-      <w:r>
-        <w:t xml:space="preserve">of 1.0. Any downstream threshold calibrated against a [0, 1] range — for example,</w:t>
+        <w:t xml:space="preserve">Both facts are captured in a</w:t>
+      </w:r>
+      <w:r>
+        <w:t xml:space="preserve"> </w:t>
+      </w:r>
+      <w:r>
+        <w:rPr>
+          <w:rStyle w:val="VerbatimChar"/>
+        </w:rPr>
+        <w:t xml:space="preserve">ReservationEligibility</w:t>
+      </w:r>
+      <w:r>
+        <w:t xml:space="preserve"> </w:t>
+      </w:r>
+      <w:r>
+        <w:t xml:space="preserve">record (the reason it is or isn’t eligible, and</w:t>
+      </w:r>
+      <w:r>
+        <w:t xml:space="preserve"> </w:t>
+      </w:r>
+      <w:r>
+        <w:t xml:space="preserve">the onboarding precondition status).</w:t>
+      </w:r>
+    </w:p>
+    <w:bookmarkEnd w:id="79"/>
+    <w:bookmarkStart w:id="80" w:name="X7024fdb44ecb4add358adc867993bf25efc3c78"/>
+    <w:p>
+      <w:pPr>
+        <w:pStyle w:val="Heading4"/>
+      </w:pPr>
+      <w:r>
+        <w:t xml:space="preserve">5.11.2 Reservations start at zero — the seed matrix (CAP-022)</w:t>
+      </w:r>
+    </w:p>
+    <w:p>
+      <w:pPr>
+        <w:pStyle w:val="FirstParagraph"/>
+      </w:pPr>
+      <w:r>
+        <w:t xml:space="preserve">ACRME does</w:t>
+      </w:r>
+      <w:r>
+        <w:t xml:space="preserve"> </w:t>
+      </w:r>
+      <w:r>
+        <w:rPr>
+          <w:bCs/>
+          <w:b/>
+        </w:rPr>
+        <w:t xml:space="preserve">not</w:t>
+      </w:r>
+      <w:r>
+        <w:t xml:space="preserve"> </w:t>
+      </w:r>
+      <w:r>
+        <w:t xml:space="preserve">guess how much capacity each product will need. Instead it starts from a</w:t>
+      </w:r>
+      <w:r>
+        <w:t xml:space="preserve"> </w:t>
+      </w:r>
+      <w:r>
+        <w:rPr>
+          <w:bCs/>
+          <w:b/>
+        </w:rPr>
+        <w:t xml:space="preserve">seed matrix</w:t>
+      </w:r>
+      <w:r>
+        <w:t xml:space="preserve">: a table of every</w:t>
+      </w:r>
+      <w:r>
+        <w:t xml:space="preserve"> </w:t>
+      </w:r>
+      <w:r>
+        <w:rPr>
+          <w:bCs/>
+          <w:b/>
+        </w:rPr>
+        <w:t xml:space="preserve">eligible SKU × availability zone</w:t>
+      </w:r>
+      <w:r>
+        <w:t xml:space="preserve"> </w:t>
+      </w:r>
+      <w:r>
+        <w:t xml:space="preserve">combination, each initialised</w:t>
+      </w:r>
+      <w:r>
+        <w:t xml:space="preserve"> </w:t>
+      </w:r>
+      <w:r>
+        <w:t xml:space="preserve">with a reserved count of</w:t>
+      </w:r>
+      <w:r>
+        <w:t xml:space="preserve"> </w:t>
+      </w:r>
+      <w:r>
+        <w:rPr>
+          <w:bCs/>
+          <w:b/>
+        </w:rPr>
+        <w:t xml:space="preserve">0</w:t>
+      </w:r>
+      <w:r>
+        <w:t xml:space="preserve">. These zero-count entries are called</w:t>
+      </w:r>
+      <w:r>
+        <w:t xml:space="preserve"> </w:t>
+      </w:r>
+      <w:r>
+        <w:rPr>
+          <w:bCs/>
+          <w:b/>
+        </w:rPr>
+        <w:t xml:space="preserve">seed reservations</w:t>
+      </w:r>
+      <w:r>
+        <w:t xml:space="preserve"> </w:t>
+      </w:r>
+      <w:r>
+        <w:t xml:space="preserve">— governed</w:t>
+      </w:r>
+      <w:r>
+        <w:t xml:space="preserve"> </w:t>
+      </w:r>
+      <w:r>
+        <w:t xml:space="preserve">placeholders that say</w:t>
       </w:r>
       <w:r>
         <w:t xml:space="preserve"> </w:t>
@@ -14862,13 +15088,7 @@
         <w:t xml:space="preserve">“</w:t>
       </w:r>
       <w:r>
-        <w:t xml:space="preserve">do not place in</w:t>
-      </w:r>
-      <w:r>
-        <w:t xml:space="preserve"> </w:t>
-      </w:r>
-      <w:r>
-        <w:t xml:space="preserve">any region scoring below 0.60</w:t>
+        <w:t xml:space="preserve">this SKU is allowed in this zone</w:t>
       </w:r>
       <w:r>
         <w:t xml:space="preserve">”</w:t>
@@ -14877,446 +15097,7 @@
         <w:t xml:space="preserve"> </w:t>
       </w:r>
       <w:r>
-        <w:t xml:space="preserve">— is now calibrated incorrectly. A mediocre region may clear the</w:t>
-      </w:r>
-      <w:r>
-        <w:t xml:space="preserve"> </w:t>
-      </w:r>
-      <w:r>
-        <w:t xml:space="preserve">threshold simply because scores are inflated.</w:t>
-      </w:r>
-    </w:p>
-    <w:p>
-      <w:pPr>
-        <w:pStyle w:val="BodyText"/>
-      </w:pPr>
-      <w:r>
-        <w:rPr>
-          <w:bCs/>
-          <w:b/>
-        </w:rPr>
-        <w:t xml:space="preserve">If weights sum to less than 1.0 (e.g., 0.90):</w:t>
-      </w:r>
-    </w:p>
-    <w:p>
-      <w:pPr>
-        <w:pStyle w:val="BodyText"/>
-      </w:pPr>
-      <w:r>
-        <w:t xml:space="preserve">All scores are uniformly compressed into [0, 0.90]. A region with all perfect components scores 0.90</w:t>
-      </w:r>
-      <w:r>
-        <w:t xml:space="preserve"> </w:t>
-      </w:r>
-      <w:r>
-        <w:t xml:space="preserve">instead of 1.0. A region that should score 0.67 now scores 0.60. Threshold gates calibrated against</w:t>
-      </w:r>
-      <w:r>
-        <w:t xml:space="preserve"> </w:t>
-      </w:r>
-      <w:r>
-        <w:t xml:space="preserve">[0, 1] now behave incorrectly in the other direction — some deployments are incorrectly blocked.</w:t>
-      </w:r>
-    </w:p>
-    <w:p>
-      <w:pPr>
-        <w:pStyle w:val="BodyText"/>
-      </w:pPr>
-      <w:r>
-        <w:t xml:space="preserve">Cross-policy comparisons also break: if one version had weights summing to 1.0 and the next has them</w:t>
-      </w:r>
-      <w:r>
-        <w:t xml:space="preserve"> </w:t>
-      </w:r>
-      <w:r>
-        <w:t xml:space="preserve">summing to 0.90, a score of 0.65 means something different under each version. Historical score</w:t>
-      </w:r>
-      <w:r>
-        <w:t xml:space="preserve"> </w:t>
-      </w:r>
-      <w:r>
-        <w:t xml:space="preserve">trend data becomes uninterpretable.</w:t>
-      </w:r>
-    </w:p>
-    <w:bookmarkEnd w:id="82"/>
-    <w:bookmarkStart w:id="83" w:name="tuning-the-weights-the-pie-rule"/>
-    <w:p>
-      <w:pPr>
-        <w:pStyle w:val="Heading3"/>
-      </w:pPr>
-      <w:r>
-        <w:t xml:space="preserve">6.4 Tuning the Weights — The Pie Rule</w:t>
-      </w:r>
-    </w:p>
-    <w:p>
-      <w:pPr>
-        <w:pStyle w:val="FirstParagraph"/>
-      </w:pPr>
-      <w:r>
-        <w:t xml:space="preserve">Think of the five weights as slices of a pie. The total pie is always exactly 100%. If one slice</w:t>
-      </w:r>
-      <w:r>
-        <w:t xml:space="preserve"> </w:t>
-      </w:r>
-      <w:r>
-        <w:t xml:space="preserve">grows, the others must shrink by the same total amount.</w:t>
-      </w:r>
-    </w:p>
-    <w:p>
-      <w:pPr>
-        <w:pStyle w:val="BodyText"/>
-      </w:pPr>
-      <w:r>
-        <w:rPr>
-          <w:bCs/>
-          <w:b/>
-        </w:rPr>
-        <w:t xml:space="preserve">Example — increasing headroom importance:</w:t>
-      </w:r>
-    </w:p>
-    <w:p>
-      <w:pPr>
-        <w:pStyle w:val="SourceCode"/>
-      </w:pPr>
-      <w:r>
-        <w:rPr>
-          <w:rStyle w:val="VerbatimChar"/>
-        </w:rPr>
-        <w:t xml:space="preserve">Before: α=0.30, β=0.20, γ=0.25, δ=0.15, ε=0.10  → sum = 1.00 ✓</w:t>
-      </w:r>
-      <w:r>
-        <w:br/>
-      </w:r>
-      <w:r>
-        <w:rPr>
-          <w:rStyle w:val="VerbatimChar"/>
-        </w:rPr>
-        <w:t xml:space="preserve">After:  α=0.40, β=0.15, γ=0.25, δ=0.10, ε=0.10  → sum = 1.00 ✓ (took 0.05 from β, 0.05 from δ)</w:t>
-      </w:r>
-      <w:r>
-        <w:br/>
-      </w:r>
-      <w:r>
-        <w:rPr>
-          <w:rStyle w:val="VerbatimChar"/>
-        </w:rPr>
-        <w:t xml:space="preserve">Wrong:  α=0.40, β=0.20, γ=0.25, δ=0.15, ε=0.10  → sum = 1.10 ✗ (forgot to reduce)</w:t>
-      </w:r>
-    </w:p>
-    <w:bookmarkEnd w:id="83"/>
-    <w:bookmarkStart w:id="84" w:name="X3da3bddaac74590e2583a245330c6c3bc498c02"/>
-    <w:p>
-      <w:pPr>
-        <w:pStyle w:val="Heading3"/>
-      </w:pPr>
-      <w:r>
-        <w:t xml:space="preserve">6.5 Validation Requirement — The Policy Load Gate</w:t>
-      </w:r>
-    </w:p>
-    <w:p>
-      <w:pPr>
-        <w:pStyle w:val="FirstParagraph"/>
-      </w:pPr>
-      <w:r>
-        <w:t xml:space="preserve">The Config/Scope-File Service</w:t>
-      </w:r>
-      <w:r>
-        <w:t xml:space="preserve"> </w:t>
-      </w:r>
-      <w:r>
-        <w:rPr>
-          <w:bCs/>
-          <w:b/>
-        </w:rPr>
-        <w:t xml:space="preserve">must</w:t>
-      </w:r>
-      <w:r>
-        <w:t xml:space="preserve"> </w:t>
-      </w:r>
-      <w:r>
-        <w:t xml:space="preserve">validate the weight sum every time a new PlacementPolicy</w:t>
-      </w:r>
-      <w:r>
-        <w:t xml:space="preserve"> </w:t>
-      </w:r>
-      <w:r>
-        <w:t xml:space="preserve">version is loaded. This validation must occur</w:t>
-      </w:r>
-      <w:r>
-        <w:t xml:space="preserve"> </w:t>
-      </w:r>
-      <w:r>
-        <w:rPr>
-          <w:bCs/>
-          <w:b/>
-        </w:rPr>
-        <w:t xml:space="preserve">before</w:t>
-      </w:r>
-      <w:r>
-        <w:t xml:space="preserve"> </w:t>
-      </w:r>
-      <w:r>
-        <w:t xml:space="preserve">the policy version is published to the</w:t>
-      </w:r>
-      <w:r>
-        <w:t xml:space="preserve"> </w:t>
-      </w:r>
-      <w:r>
-        <w:t xml:space="preserve">placement engine. A policy that fails this check must be rejected with a recorded configuration</w:t>
-      </w:r>
-      <w:r>
-        <w:t xml:space="preserve"> </w:t>
-      </w:r>
-      <w:r>
-        <w:t xml:space="preserve">error; the placement engine must never receive a policy with an invalid weight sum.</w:t>
-      </w:r>
-    </w:p>
-    <w:p>
-      <w:pPr>
-        <w:pStyle w:val="BodyText"/>
-      </w:pPr>
-      <w:r>
-        <w:t xml:space="preserve">See Section 6 of the Calculation Logic Reference and Section 8.2 of the Technical Design Document for the</w:t>
-      </w:r>
-      <w:r>
-        <w:t xml:space="preserve"> </w:t>
-      </w:r>
-      <w:r>
-        <w:t xml:space="preserve">formal validation rule specification.</w:t>
-      </w:r>
-    </w:p>
-    <w:p>
-      <w:r>
-        <w:pict>
-          <v:rect style="width:0;height:1.5pt" o:hralign="center" o:hrstd="t" o:hr="t"/>
-        </w:pict>
-      </w:r>
-    </w:p>
-    <w:bookmarkEnd w:id="84"/>
-    <w:bookmarkEnd w:id="85"/>
-    <w:bookmarkStart w:id="86" w:name="how-the-three-domains-connect"/>
-    <w:p>
-      <w:pPr>
-        <w:pStyle w:val="Heading2"/>
-      </w:pPr>
-      <w:r>
-        <w:t xml:space="preserve">7. How the Three Domains Connect</w:t>
-      </w:r>
-    </w:p>
-    <w:p>
-      <w:pPr>
-        <w:pStyle w:val="FirstParagraph"/>
-      </w:pPr>
-      <w:r>
-        <w:t xml:space="preserve">The three domains are not independent. They feed into each other:</w:t>
-      </w:r>
-    </w:p>
-    <w:p>
-      <w:pPr>
-        <w:pStyle w:val="SourceCode"/>
-      </w:pPr>
-      <w:r>
-        <w:rPr>
-          <w:rStyle w:val="VerbatimChar"/>
-        </w:rPr>
-        <w:t xml:space="preserve">Region Selection → Quota Management → Capacity Management</w:t>
-      </w:r>
-      <w:r>
-        <w:br/>
-      </w:r>
-      <w:r>
-        <w:rPr>
-          <w:rStyle w:val="VerbatimChar"/>
-        </w:rPr>
-        <w:t xml:space="preserve">       ↑                  ↑                    ↑</w:t>
-      </w:r>
-      <w:r>
-        <w:br/>
-      </w:r>
-      <w:r>
-        <w:rPr>
-          <w:rStyle w:val="VerbatimChar"/>
-        </w:rPr>
-        <w:t xml:space="preserve">  Uses quota scores   Uses CRG quantities   Uses placement output</w:t>
-      </w:r>
-      <w:r>
-        <w:br/>
-      </w:r>
-      <w:r>
-        <w:rPr>
-          <w:rStyle w:val="VerbatimChar"/>
-        </w:rPr>
-        <w:t xml:space="preserve">  as β component      to size pool limit    to set CRG targets</w:t>
-      </w:r>
-    </w:p>
-    <w:p>
-      <w:pPr>
-        <w:pStyle w:val="FirstParagraph"/>
-      </w:pPr>
-      <w:r>
-        <w:rPr>
-          <w:bCs/>
-          <w:b/>
-        </w:rPr>
-        <w:t xml:space="preserve">Flow for a new customer deployment:</w:t>
-      </w:r>
-    </w:p>
-    <w:p>
-      <w:pPr>
-        <w:numPr>
-          <w:ilvl w:val="0"/>
-          <w:numId w:val="1015"/>
-        </w:numPr>
-      </w:pPr>
-      <w:r>
-        <w:rPr>
-          <w:bCs/>
-          <w:b/>
-        </w:rPr>
-        <w:t xml:space="preserve">Region Selection</w:t>
-      </w:r>
-      <w:r>
-        <w:t xml:space="preserve"> </w:t>
-      </w:r>
-      <w:r>
-        <w:t xml:space="preserve">scores all candidate regions and picks the best Prod anchor. The quota</w:t>
-      </w:r>
-      <w:r>
-        <w:t xml:space="preserve"> </w:t>
-      </w:r>
-      <w:r>
-        <w:t xml:space="preserve">score (β component) uses current quota headroom from Domain 2. The capacity/headroom score</w:t>
-      </w:r>
-      <w:r>
-        <w:t xml:space="preserve"> </w:t>
-      </w:r>
-      <w:r>
-        <w:t xml:space="preserve">(α component) uses current CRG free slots from Domain 3.</w:t>
-      </w:r>
-    </w:p>
-    <w:p>
-      <w:pPr>
-        <w:numPr>
-          <w:ilvl w:val="0"/>
-          <w:numId w:val="1015"/>
-        </w:numPr>
-      </w:pPr>
-      <w:r>
-        <w:rPr>
-          <w:bCs/>
-          <w:b/>
-        </w:rPr>
-        <w:t xml:space="preserve">Quota Management</w:t>
-      </w:r>
-      <w:r>
-        <w:t xml:space="preserve"> </w:t>
-      </w:r>
-      <w:r>
-        <w:t xml:space="preserve">checks that the subscription in the selected region has enough quota limit</w:t>
-      </w:r>
-      <w:r>
-        <w:t xml:space="preserve"> </w:t>
-      </w:r>
-      <w:r>
-        <w:t xml:space="preserve">to accept the new deployment (Scenario 19, gate 7). If not, the deployment is blocked with</w:t>
-      </w:r>
-      <w:r>
-        <w:t xml:space="preserve"> </w:t>
-      </w:r>
-      <w:r>
-        <w:rPr>
-          <w:rStyle w:val="VerbatimChar"/>
-        </w:rPr>
-        <w:t xml:space="preserve">QUOTA_DEFICIT</w:t>
-      </w:r>
-      <w:r>
-        <w:t xml:space="preserve"> </w:t>
-      </w:r>
-      <w:r>
-        <w:t xml:space="preserve">until a quota increase request to Microsoft is approved.</w:t>
-      </w:r>
-    </w:p>
-    <w:p>
-      <w:pPr>
-        <w:numPr>
-          <w:ilvl w:val="0"/>
-          <w:numId w:val="1015"/>
-        </w:numPr>
-      </w:pPr>
-      <w:r>
-        <w:rPr>
-          <w:bCs/>
-          <w:b/>
-        </w:rPr>
-        <w:t xml:space="preserve">Capacity Management</w:t>
-      </w:r>
-      <w:r>
-        <w:t xml:space="preserve"> </w:t>
-      </w:r>
-      <w:r>
-        <w:t xml:space="preserve">checks that a Capacity Reservation exists and has enough quantity for</w:t>
-      </w:r>
-      <w:r>
-        <w:t xml:space="preserve"> </w:t>
-      </w:r>
-      <w:r>
-        <w:t xml:space="preserve">the deployment (Scenario 19, gate 6). If not, the deployment is blocked with</w:t>
-      </w:r>
-      <w:r>
-        <w:t xml:space="preserve"> </w:t>
-      </w:r>
-      <w:r>
-        <w:rPr>
-          <w:rStyle w:val="VerbatimChar"/>
-        </w:rPr>
-        <w:t xml:space="preserve">RESERVATION_DEFICIT</w:t>
-      </w:r>
-      <w:r>
-        <w:t xml:space="preserve"> </w:t>
-      </w:r>
-      <w:r>
-        <w:t xml:space="preserve">until the CRG is expanded.</w:t>
-      </w:r>
-    </w:p>
-    <w:p>
-      <w:pPr>
-        <w:pStyle w:val="FirstParagraph"/>
-      </w:pPr>
-      <w:r>
-        <w:t xml:space="preserve">Only when all three domains return green does the readiness gate emit</w:t>
-      </w:r>
-      <w:r>
-        <w:t xml:space="preserve"> </w:t>
-      </w:r>
-      <w:r>
-        <w:rPr>
-          <w:rStyle w:val="VerbatimChar"/>
-        </w:rPr>
-        <w:t xml:space="preserve">READY</w:t>
-      </w:r>
-      <w:r>
-        <w:t xml:space="preserve"> </w:t>
-      </w:r>
-      <w:r>
-        <w:t xml:space="preserve">and allow the</w:t>
-      </w:r>
-      <w:r>
-        <w:t xml:space="preserve"> </w:t>
-      </w:r>
-      <w:r>
-        <w:t xml:space="preserve">deployment to proceed.</w:t>
-      </w:r>
-    </w:p>
-    <w:p>
-      <w:pPr>
-        <w:pStyle w:val="BodyText"/>
-      </w:pPr>
-      <w:r>
-        <w:rPr>
-          <w:bCs/>
-          <w:b/>
-        </w:rPr>
-        <w:t xml:space="preserve">Flow for a DR event:</w:t>
+        <w:t xml:space="preserve">without reserving anything yet.</w:t>
       </w:r>
     </w:p>
     <w:p>
@@ -15328,19 +15109,35 @@
         <w:pStyle w:val="Compact"/>
       </w:pPr>
       <w:r>
-        <w:t xml:space="preserve">The engine transitions to</w:t>
-      </w:r>
-      <w:r>
-        <w:t xml:space="preserve"> </w:t>
-      </w:r>
-      <w:r>
-        <w:rPr>
-          <w:rStyle w:val="VerbatimChar"/>
-        </w:rPr>
-        <w:t xml:space="preserve">DR_EVENT_ACTIVE</w:t>
-      </w:r>
-      <w:r>
-        <w:t xml:space="preserve">.</w:t>
+        <w:t xml:space="preserve">A seed reservation only grows above 0 when the</w:t>
+      </w:r>
+      <w:r>
+        <w:t xml:space="preserve"> </w:t>
+      </w:r>
+      <w:r>
+        <w:rPr>
+          <w:bCs/>
+          <w:b/>
+        </w:rPr>
+        <w:t xml:space="preserve">product team’s budget governance</w:t>
+      </w:r>
+      <w:r>
+        <w:t xml:space="preserve"> </w:t>
+      </w:r>
+      <w:r>
+        <w:t xml:space="preserve">approves it.</w:t>
+      </w:r>
+      <w:r>
+        <w:t xml:space="preserve"> </w:t>
+      </w:r>
+      <w:r>
+        <w:t xml:space="preserve">Capacity costs money, so the product team owns the decision to fund it. This extends the existing</w:t>
+      </w:r>
+      <w:r>
+        <w:t xml:space="preserve"> </w:t>
+      </w:r>
+      <w:r>
+        <w:t xml:space="preserve">seed model (CAP-009).</w:t>
       </w:r>
     </w:p>
     <w:p>
@@ -15352,20 +15149,129 @@
         <w:pStyle w:val="Compact"/>
       </w:pPr>
       <w:r>
-        <w:t xml:space="preserve">The DR Orchestrator consults the SourceDestinationDRIndex to identify which standby VMs need</w:t>
-      </w:r>
-      <w:r>
-        <w:t xml:space="preserve"> </w:t>
-      </w:r>
-      <w:r>
-        <w:t xml:space="preserve">to be activated and where.</w:t>
+        <w:t xml:space="preserve">Because the matrix begins at 0, there is no speculative spend — capacity is reserved only when a</w:t>
+      </w:r>
+      <w:r>
+        <w:t xml:space="preserve"> </w:t>
+      </w:r>
+      <w:r>
+        <w:t xml:space="preserve">real, funded need appears.</w:t>
+      </w:r>
+    </w:p>
+    <w:p>
+      <w:pPr>
+        <w:pStyle w:val="FirstParagraph"/>
+      </w:pPr>
+      <w:r>
+        <w:t xml:space="preserve">A</w:t>
+      </w:r>
+      <w:r>
+        <w:t xml:space="preserve"> </w:t>
+      </w:r>
+      <w:r>
+        <w:rPr>
+          <w:rStyle w:val="VerbatimChar"/>
+        </w:rPr>
+        <w:t xml:space="preserve">SeedMatrixEntry</w:t>
+      </w:r>
+      <w:r>
+        <w:t xml:space="preserve"> </w:t>
+      </w:r>
+      <w:r>
+        <w:t xml:space="preserve">records the SKU, zone, environment, current count, and governance status. A</w:t>
+      </w:r>
+      <w:r>
+        <w:t xml:space="preserve"> </w:t>
+      </w:r>
+      <w:r>
+        <w:t xml:space="preserve">reservation is tagged</w:t>
+      </w:r>
+      <w:r>
+        <w:t xml:space="preserve"> </w:t>
+      </w:r>
+      <w:r>
+        <w:rPr>
+          <w:rStyle w:val="VerbatimChar"/>
+        </w:rPr>
+        <w:t xml:space="preserve">SEED</w:t>
+      </w:r>
+      <w:r>
+        <w:t xml:space="preserve"> </w:t>
+      </w:r>
+      <w:r>
+        <w:t xml:space="preserve">(still at/for the placeholder) or</w:t>
+      </w:r>
+      <w:r>
+        <w:t xml:space="preserve"> </w:t>
+      </w:r>
+      <w:r>
+        <w:rPr>
+          <w:rStyle w:val="VerbatimChar"/>
+        </w:rPr>
+        <w:t xml:space="preserve">ACTIVE</w:t>
+      </w:r>
+      <w:r>
+        <w:t xml:space="preserve"> </w:t>
+      </w:r>
+      <w:r>
+        <w:t xml:space="preserve">(funded and holding capacity).</w:t>
+      </w:r>
+    </w:p>
+    <w:bookmarkEnd w:id="80"/>
+    <w:bookmarkStart w:id="81" w:name="Xd40c0bc5b6dda958376c2197f240bcb27ff8ce8"/>
+    <w:p>
+      <w:pPr>
+        <w:pStyle w:val="Heading4"/>
+      </w:pPr>
+      <w:r>
+        <w:t xml:space="preserve">5.11.3 One regional CRG plus one CRG per zone (CAP-023)</w:t>
+      </w:r>
+    </w:p>
+    <w:p>
+      <w:pPr>
+        <w:pStyle w:val="FirstParagraph"/>
+      </w:pPr>
+      <w:r>
+        <w:t xml:space="preserve">Earlier sections described three CRGs per region (Prod, NonProd, DR). v2.4 makes the</w:t>
+      </w:r>
+      <w:r>
+        <w:t xml:space="preserve"> </w:t>
+      </w:r>
+      <w:r>
+        <w:rPr>
+          <w:bCs/>
+          <w:b/>
+        </w:rPr>
+        <w:t xml:space="preserve">zonal</w:t>
+      </w:r>
+      <w:r>
+        <w:t xml:space="preserve"> </w:t>
+      </w:r>
+      <w:r>
+        <w:t xml:space="preserve">structure explicit:</w:t>
+      </w:r>
+      <w:r>
+        <w:t xml:space="preserve"> </w:t>
+      </w:r>
+      <w:r>
+        <w:rPr>
+          <w:bCs/>
+          <w:b/>
+        </w:rPr>
+        <w:t xml:space="preserve">each environment</w:t>
+      </w:r>
+      <w:r>
+        <w:t xml:space="preserve"> </w:t>
+      </w:r>
+      <w:r>
+        <w:t xml:space="preserve">gets</w:t>
       </w:r>
     </w:p>
     <w:p>
       <w:pPr>
         <w:numPr>
           <w:ilvl w:val="0"/>
-          <w:numId w:val="1016"/>
+          <w:numId w:val="1017"/>
         </w:numPr>
         <w:pStyle w:val="Compact"/>
       </w:pPr>
@@ -15374,26 +15280,32 @@
           <w:bCs/>
           <w:b/>
         </w:rPr>
-        <w:t xml:space="preserve">Capacity Management</w:t>
-      </w:r>
-      <w:r>
-        <w:t xml:space="preserve"> </w:t>
-      </w:r>
-      <w:r>
-        <w:t xml:space="preserve">begins staged activation (Scenario 18): bootstrap headroom first, then</w:t>
-      </w:r>
-      <w:r>
-        <w:t xml:space="preserve"> </w:t>
-      </w:r>
-      <w:r>
-        <w:t xml:space="preserve">CRG expansion if needed, then CVAL release, then quota draw.</w:t>
+        <w:t xml:space="preserve">one regional CRG</w:t>
+      </w:r>
+      <w:r>
+        <w:t xml:space="preserve"> </w:t>
+      </w:r>
+      <w:r>
+        <w:t xml:space="preserve">(named</w:t>
+      </w:r>
+      <w:r>
+        <w:t xml:space="preserve"> </w:t>
+      </w:r>
+      <w:r>
+        <w:rPr>
+          <w:rStyle w:val="VerbatimChar"/>
+        </w:rPr>
+        <w:t xml:space="preserve">crg-&lt;env&gt;-&lt;region&gt;-reg</w:t>
+      </w:r>
+      <w:r>
+        <w:t xml:space="preserve">), plus</w:t>
       </w:r>
     </w:p>
     <w:p>
       <w:pPr>
         <w:numPr>
           <w:ilvl w:val="0"/>
-          <w:numId w:val="1016"/>
+          <w:numId w:val="1017"/>
         </w:numPr>
         <w:pStyle w:val="Compact"/>
       </w:pPr>
@@ -15402,47 +15314,531 @@
           <w:bCs/>
           <w:b/>
         </w:rPr>
-        <w:t xml:space="preserve">Quota Management</w:t>
-      </w:r>
-      <w:r>
-        <w:t xml:space="preserve"> </w:t>
-      </w:r>
-      <w:r>
-        <w:t xml:space="preserve">confirms the shared pool has headroom for the DR draw (single-pool model:</w:t>
-      </w:r>
-      <w:r>
-        <w:t xml:space="preserve"> </w:t>
-      </w:r>
-      <w:r>
-        <w:t xml:space="preserve">no cross-group transfer needed — the DR earmark is already inside the pool).</w:t>
+        <w:t xml:space="preserve">one CRG per availability zone</w:t>
+      </w:r>
+      <w:r>
+        <w:t xml:space="preserve"> </w:t>
+      </w:r>
+      <w:r>
+        <w:t xml:space="preserve">(</w:t>
+      </w:r>
+      <w:r>
+        <w:rPr>
+          <w:rStyle w:val="VerbatimChar"/>
+        </w:rPr>
+        <w:t xml:space="preserve">az1</w:t>
+      </w:r>
+      <w:r>
+        <w:t xml:space="preserve">,</w:t>
+      </w:r>
+      <w:r>
+        <w:t xml:space="preserve"> </w:t>
+      </w:r>
+      <w:r>
+        <w:rPr>
+          <w:rStyle w:val="VerbatimChar"/>
+        </w:rPr>
+        <w:t xml:space="preserve">az2</w:t>
+      </w:r>
+      <w:r>
+        <w:t xml:space="preserve">,</w:t>
+      </w:r>
+      <w:r>
+        <w:t xml:space="preserve"> </w:t>
+      </w:r>
+      <w:r>
+        <w:rPr>
+          <w:rStyle w:val="VerbatimChar"/>
+        </w:rPr>
+        <w:t xml:space="preserve">az3</w:t>
+      </w:r>
+      <w:r>
+        <w:t xml:space="preserve">).</w:t>
+      </w:r>
+    </w:p>
+    <w:p>
+      <w:pPr>
+        <w:pStyle w:val="FirstParagraph"/>
+      </w:pPr>
+      <w:r>
+        <w:t xml:space="preserve">This lets ACRME hold and size reservations</w:t>
+      </w:r>
+      <w:r>
+        <w:t xml:space="preserve"> </w:t>
+      </w:r>
+      <w:r>
+        <w:rPr>
+          <w:bCs/>
+          <w:b/>
+        </w:rPr>
+        <w:t xml:space="preserve">per zone</w:t>
+      </w:r>
+      <w:r>
+        <w:t xml:space="preserve">, which is what makes the even-distribution</w:t>
+      </w:r>
+      <w:r>
+        <w:t xml:space="preserve"> </w:t>
+      </w:r>
+      <w:r>
+        <w:t xml:space="preserve">target below meaningful. All names are produced by the deterministic naming convention (OPS-006, see</w:t>
+      </w:r>
+      <w:r>
+        <w:t xml:space="preserve"> </w:t>
+      </w:r>
+      <w:r>
+        <w:t xml:space="preserve">Section 5.11.6).</w:t>
+      </w:r>
+    </w:p>
+    <w:bookmarkEnd w:id="81"/>
+    <w:bookmarkStart w:id="82" w:name="X61b6839c6359b0d3e32acd8230ab2d40f0db2d3"/>
+    <w:p>
+      <w:pPr>
+        <w:pStyle w:val="Heading4"/>
+      </w:pPr>
+      <w:r>
+        <w:t xml:space="preserve">5.11.4 Reactive discovery — filling gaps automatically (CAP-024)</w:t>
+      </w:r>
+    </w:p>
+    <w:p>
+      <w:pPr>
+        <w:pStyle w:val="FirstParagraph"/>
+      </w:pPr>
+      <w:r>
+        <w:t xml:space="preserve">When a request arrives for a SKU/zone combination that</w:t>
+      </w:r>
+      <w:r>
+        <w:t xml:space="preserve"> </w:t>
+      </w:r>
+      <w:r>
+        <w:rPr>
+          <w:bCs/>
+          <w:b/>
+        </w:rPr>
+        <w:t xml:space="preserve">isn’t yet backed by a CRG</w:t>
+      </w:r>
+      <w:r>
+        <w:t xml:space="preserve">, ACRME does not</w:t>
+      </w:r>
+      <w:r>
+        <w:t xml:space="preserve"> </w:t>
+      </w:r>
+      <w:r>
+        <w:t xml:space="preserve">simply fail. It</w:t>
+      </w:r>
+      <w:r>
+        <w:t xml:space="preserve"> </w:t>
+      </w:r>
+      <w:r>
+        <w:rPr>
+          <w:bCs/>
+          <w:b/>
+        </w:rPr>
+        <w:t xml:space="preserve">reactively discovers</w:t>
+      </w:r>
+      <w:r>
+        <w:t xml:space="preserve"> </w:t>
+      </w:r>
+      <w:r>
+        <w:t xml:space="preserve">the gap and</w:t>
+      </w:r>
+      <w:r>
+        <w:t xml:space="preserve"> </w:t>
+      </w:r>
+      <w:r>
+        <w:rPr>
+          <w:bCs/>
+          <w:b/>
+        </w:rPr>
+        <w:t xml:space="preserve">auto-creates</w:t>
+      </w:r>
+      <w:r>
+        <w:t xml:space="preserve"> </w:t>
+      </w:r>
+      <w:r>
+        <w:t xml:space="preserve">the missing reservation against</w:t>
+      </w:r>
+      <w:r>
+        <w:t xml:space="preserve"> </w:t>
+      </w:r>
+      <w:r>
+        <w:t xml:space="preserve">the seed matrix, then</w:t>
+      </w:r>
+      <w:r>
+        <w:t xml:space="preserve"> </w:t>
+      </w:r>
+      <w:r>
+        <w:rPr>
+          <w:bCs/>
+          <w:b/>
+        </w:rPr>
+        <w:t xml:space="preserve">raises a scope-file governance item</w:t>
+      </w:r>
+      <w:r>
+        <w:t xml:space="preserve"> </w:t>
+      </w:r>
+      <w:r>
+        <w:t xml:space="preserve">so the addition is reviewed rather than</w:t>
+      </w:r>
+      <w:r>
+        <w:t xml:space="preserve"> </w:t>
+      </w:r>
+      <w:r>
+        <w:t xml:space="preserve">silently accepted. This reconciles the earlier reactive-discovery governance requirement (CAP-019).</w:t>
+      </w:r>
+      <w:r>
+        <w:t xml:space="preserve"> </w:t>
+      </w:r>
+      <w:r>
+        <w:t xml:space="preserve">Each auto-created reservation is stamped with its provenance (reactive vs. seeded vs. planned), and it</w:t>
+      </w:r>
+      <w:r>
+        <w:t xml:space="preserve"> </w:t>
+      </w:r>
+      <w:r>
+        <w:t xml:space="preserve">still respects the eligibility rules in 5.11.1.</w:t>
+      </w:r>
+    </w:p>
+    <w:bookmarkEnd w:id="82"/>
+    <w:bookmarkStart w:id="83" w:name="Xe97231c935d9c54d9bbc2bfb9ec1bd97905fdb0"/>
+    <w:p>
+      <w:pPr>
+        <w:pStyle w:val="Heading4"/>
+      </w:pPr>
+      <w:r>
+        <w:t xml:space="preserve">5.11.5 Spreading VMs evenly across zones (PLC-011)</w:t>
+      </w:r>
+    </w:p>
+    <w:p>
+      <w:pPr>
+        <w:pStyle w:val="FirstParagraph"/>
+      </w:pPr>
+      <w:r>
+        <w:t xml:space="preserve">Within the region already chosen, ACRME aims to spread a workload’s VMs</w:t>
+      </w:r>
+      <w:r>
+        <w:t xml:space="preserve"> </w:t>
+      </w:r>
+      <w:r>
+        <w:rPr>
+          <w:bCs/>
+          <w:b/>
+        </w:rPr>
+        <w:t xml:space="preserve">evenly across the zones</w:t>
+      </w:r>
+      <w:r>
+        <w:t xml:space="preserve"> </w:t>
+      </w:r>
+      <w:r>
+        <w:t xml:space="preserve">—</w:t>
+      </w:r>
+      <w:r>
+        <w:t xml:space="preserve"> </w:t>
+      </w:r>
+      <w:r>
+        <w:t xml:space="preserve">about</w:t>
+      </w:r>
+      <w:r>
+        <w:t xml:space="preserve"> </w:t>
+      </w:r>
+      <w:r>
+        <w:rPr>
+          <w:rStyle w:val="VerbatimChar"/>
+          <w:bCs/>
+          <w:b/>
+        </w:rPr>
+        <w:t xml:space="preserve">1 / zone_count</w:t>
+      </w:r>
+      <w:r>
+        <w:t xml:space="preserve"> </w:t>
+      </w:r>
+      <w:r>
+        <w:t xml:space="preserve">per zone (≈ 33% each in a three-zone region). This is a placement</w:t>
+      </w:r>
+      <w:r>
+        <w:t xml:space="preserve"> </w:t>
+      </w:r>
+      <w:r>
+        <w:rPr>
+          <w:bCs/>
+          <w:b/>
+        </w:rPr>
+        <w:t xml:space="preserve">target</w:t>
+      </w:r>
+      <w:r>
+        <w:t xml:space="preserve">, not just the ε</w:t>
+      </w:r>
+      <w:r>
+        <w:t xml:space="preserve"> </w:t>
+      </w:r>
+      <w:r>
+        <w:t xml:space="preserve">“</w:t>
+      </w:r>
+      <w:r>
+        <w:t xml:space="preserve">zone diversity</w:t>
+      </w:r>
+      <w:r>
+        <w:t xml:space="preserve">”</w:t>
+      </w:r>
+      <w:r>
+        <w:t xml:space="preserve"> </w:t>
+      </w:r>
+      <w:r>
+        <w:t xml:space="preserve">scoring nudge used during region selection:</w:t>
       </w:r>
     </w:p>
     <w:p>
       <w:pPr>
         <w:numPr>
           <w:ilvl w:val="0"/>
-          <w:numId w:val="1016"/>
+          <w:numId w:val="1018"/>
         </w:numPr>
         <w:pStyle w:val="Compact"/>
       </w:pPr>
       <w:r>
-        <w:rPr>
-          <w:bCs/>
-          <w:b/>
-        </w:rPr>
-        <w:t xml:space="preserve">Region Selection</w:t>
-      </w:r>
-      <w:r>
-        <w:t xml:space="preserve"> </w:t>
-      </w:r>
-      <w:r>
-        <w:t xml:space="preserve">is not re-run — the Customer Seed Record is authoritative. Failback</w:t>
-      </w:r>
-      <w:r>
-        <w:t xml:space="preserve"> </w:t>
-      </w:r>
-      <w:r>
-        <w:t xml:space="preserve">restores the original seed without re-derivation.</w:t>
+        <w:t xml:space="preserve">When placing a new VM, the engine</w:t>
+      </w:r>
+      <w:r>
+        <w:t xml:space="preserve"> </w:t>
+      </w:r>
+      <w:r>
+        <w:rPr>
+          <w:bCs/>
+          <w:b/>
+        </w:rPr>
+        <w:t xml:space="preserve">prefers the most under-represented zone</w:t>
+      </w:r>
+      <w:r>
+        <w:t xml:space="preserve"> </w:t>
+      </w:r>
+      <w:r>
+        <w:t xml:space="preserve">(the one with the</w:t>
+      </w:r>
+      <w:r>
+        <w:t xml:space="preserve"> </w:t>
+      </w:r>
+      <w:r>
+        <w:t xml:space="preserve">fewest VMs so far).</w:t>
+      </w:r>
+    </w:p>
+    <w:p>
+      <w:pPr>
+        <w:numPr>
+          <w:ilvl w:val="0"/>
+          <w:numId w:val="1018"/>
+        </w:numPr>
+        <w:pStyle w:val="Compact"/>
+      </w:pPr>
+      <w:r>
+        <w:t xml:space="preserve">When a new deployment or a growth event would tilt the balance</w:t>
+      </w:r>
+      <w:r>
+        <w:t xml:space="preserve"> </w:t>
+      </w:r>
+      <w:r>
+        <w:rPr>
+          <w:bCs/>
+          <w:b/>
+        </w:rPr>
+        <w:t xml:space="preserve">beyond a configured tolerance</w:t>
+      </w:r>
+      <w:r>
+        <w:t xml:space="preserve"> </w:t>
+      </w:r>
+      <w:r>
+        <w:t xml:space="preserve">(</w:t>
+      </w:r>
+      <w:r>
+        <w:rPr>
+          <w:rStyle w:val="VerbatimChar"/>
+        </w:rPr>
+        <w:t xml:space="preserve">C-13</w:t>
+      </w:r>
+      <w:r>
+        <w:t xml:space="preserve">), the engine raises a</w:t>
+      </w:r>
+      <w:r>
+        <w:t xml:space="preserve"> </w:t>
+      </w:r>
+      <w:r>
+        <w:rPr>
+          <w:bCs/>
+          <w:b/>
+        </w:rPr>
+        <w:t xml:space="preserve">rebalancing recommendation/action</w:t>
+      </w:r>
+      <w:r>
+        <w:t xml:space="preserve"> </w:t>
+      </w:r>
+      <w:r>
+        <w:t xml:space="preserve">to move things back toward even</w:t>
+      </w:r>
+      <w:r>
+        <w:t xml:space="preserve"> </w:t>
+      </w:r>
+      <w:r>
+        <w:t xml:space="preserve">— subject to approval and whether Azure can actually accommodate the move.</w:t>
+      </w:r>
+    </w:p>
+    <w:p>
+      <w:pPr>
+        <w:pStyle w:val="FirstParagraph"/>
+      </w:pPr>
+      <w:r>
+        <w:t xml:space="preserve">The skew maths is simple:</w:t>
+      </w:r>
+    </w:p>
+    <w:p>
+      <w:pPr>
+        <w:pStyle w:val="SourceCode"/>
+      </w:pPr>
+      <w:r>
+        <w:rPr>
+          <w:rStyle w:val="VerbatimChar"/>
+        </w:rPr>
+        <w:t xml:space="preserve">Even Zone Share          = 1 / Zone Count                      (≈33% in a 3-zone region)</w:t>
+      </w:r>
+      <w:r>
+        <w:br/>
+      </w:r>
+      <w:r>
+        <w:rPr>
+          <w:rStyle w:val="VerbatimChar"/>
+        </w:rPr>
+        <w:t xml:space="preserve">Target VMs per Zone      = round( Workload VM Count / Zone Count )</w:t>
+      </w:r>
+      <w:r>
+        <w:br/>
+      </w:r>
+      <w:r>
+        <w:rPr>
+          <w:rStyle w:val="VerbatimChar"/>
+        </w:rPr>
+        <w:t xml:space="preserve">Zone Skew(z)             = VMs in zone z − Target VMs per Zone</w:t>
+      </w:r>
+      <w:r>
+        <w:br/>
+      </w:r>
+      <w:r>
+        <w:rPr>
+          <w:rStyle w:val="VerbatimChar"/>
+        </w:rPr>
+        <w:t xml:space="preserve">Max Skew                 = largest |Zone Skew(z)| across zones</w:t>
+      </w:r>
+      <w:r>
+        <w:br/>
+      </w:r>
+      <w:r>
+        <w:rPr>
+          <w:rStyle w:val="VerbatimChar"/>
+        </w:rPr>
+        <w:t xml:space="preserve">Rebalance Trigger        = Max Skew &gt; Configured Skew Tolerance (C-13)</w:t>
+      </w:r>
+      <w:r>
+        <w:br/>
+      </w:r>
+      <w:r>
+        <w:rPr>
+          <w:rStyle w:val="VerbatimChar"/>
+        </w:rPr>
+        <w:t xml:space="preserve">Preferred Placement Zone = the zone with the fewest VMs (argmin)</w:t>
+      </w:r>
+    </w:p>
+    <w:p>
+      <w:pPr>
+        <w:pStyle w:val="FirstParagraph"/>
+      </w:pPr>
+      <w:r>
+        <w:t xml:space="preserve">Even distribution bounds how exposed a workload is if a single zone fails, and it keeps the per-AZ</w:t>
+      </w:r>
+      <w:r>
+        <w:t xml:space="preserve"> </w:t>
+      </w:r>
+      <w:r>
+        <w:t xml:space="preserve">CRGs (5.11.3) balanced. (Formal version: Appendix A.9.)</w:t>
+      </w:r>
+    </w:p>
+    <w:bookmarkEnd w:id="83"/>
+    <w:bookmarkStart w:id="84" w:name="Xee578170588982eebd4ec73d3927e7f55ba811b"/>
+    <w:p>
+      <w:pPr>
+        <w:pStyle w:val="Heading4"/>
+      </w:pPr>
+      <w:r>
+        <w:t xml:space="preserve">5.11.6 Predictable names for everything (OPS-006, C-12)</w:t>
+      </w:r>
+    </w:p>
+    <w:p>
+      <w:pPr>
+        <w:pStyle w:val="FirstParagraph"/>
+      </w:pPr>
+      <w:r>
+        <w:t xml:space="preserve">Finally, v2.4 pins down a</w:t>
+      </w:r>
+      <w:r>
+        <w:t xml:space="preserve"> </w:t>
+      </w:r>
+      <w:r>
+        <w:rPr>
+          <w:bCs/>
+          <w:b/>
+        </w:rPr>
+        <w:t xml:space="preserve">deterministic naming convention</w:t>
+      </w:r>
+      <w:r>
+        <w:t xml:space="preserve"> </w:t>
+      </w:r>
+      <w:r>
+        <w:t xml:space="preserve">for resource groups, CRGs, and</w:t>
+      </w:r>
+      <w:r>
+        <w:t xml:space="preserve"> </w:t>
+      </w:r>
+      <w:r>
+        <w:t xml:space="preserve">subscriptions, backed by a</w:t>
+      </w:r>
+      <w:r>
+        <w:t xml:space="preserve"> </w:t>
+      </w:r>
+      <w:r>
+        <w:rPr>
+          <w:bCs/>
+          <w:b/>
+        </w:rPr>
+        <w:t xml:space="preserve">counter (C-12)</w:t>
+      </w:r>
+      <w:r>
+        <w:t xml:space="preserve"> </w:t>
+      </w:r>
+      <w:r>
+        <w:t xml:space="preserve">that guarantees uniqueness. In plain terms: given the</w:t>
+      </w:r>
+      <w:r>
+        <w:t xml:space="preserve"> </w:t>
+      </w:r>
+      <w:r>
+        <w:t xml:space="preserve">same inputs, ACRME always produces the</w:t>
+      </w:r>
+      <w:r>
+        <w:t xml:space="preserve"> </w:t>
+      </w:r>
+      <w:r>
+        <w:rPr>
+          <w:bCs/>
+          <w:b/>
+        </w:rPr>
+        <w:t xml:space="preserve">same, collision-free name</w:t>
+      </w:r>
+      <w:r>
+        <w:t xml:space="preserve"> </w:t>
+      </w:r>
+      <w:r>
+        <w:t xml:space="preserve">— so resources are predictable,</w:t>
+      </w:r>
+      <w:r>
+        <w:t xml:space="preserve"> </w:t>
+      </w:r>
+      <w:r>
+        <w:t xml:space="preserve">auditable, and RBAC scopes attach to stable identities instead of ad-hoc names.</w:t>
       </w:r>
     </w:p>
     <w:p>
@@ -15452,17 +15848,866 @@
         </w:pict>
       </w:r>
     </w:p>
+    <w:bookmarkEnd w:id="84"/>
+    <w:bookmarkEnd w:id="85"/>
     <w:bookmarkEnd w:id="86"/>
-    <w:bookmarkStart w:id="96" w:name="quick-reference-key-numbers"/>
+    <w:bookmarkStart w:id="92" w:name="scoring-weight-invariant"/>
     <w:p>
       <w:pPr>
         <w:pStyle w:val="Heading2"/>
       </w:pPr>
       <w:r>
+        <w:t xml:space="preserve">6. Scoring Weight Invariant</w:t>
+      </w:r>
+    </w:p>
+    <w:bookmarkStart w:id="87" w:name="the-rule"/>
+    <w:p>
+      <w:pPr>
+        <w:pStyle w:val="Heading3"/>
+      </w:pPr>
+      <w:r>
+        <w:t xml:space="preserve">6.1 The Rule</w:t>
+      </w:r>
+    </w:p>
+    <w:p>
+      <w:pPr>
+        <w:pStyle w:val="FirstParagraph"/>
+      </w:pPr>
+      <w:r>
+        <w:rPr>
+          <w:bCs/>
+          <w:b/>
+        </w:rPr>
+        <w:t xml:space="preserve">The five placement scoring weights must always sum to exactly 1.0:</w:t>
+      </w:r>
+    </w:p>
+    <w:p>
+      <w:pPr>
+        <w:pStyle w:val="SourceCode"/>
+      </w:pPr>
+      <w:r>
+        <w:rPr>
+          <w:rStyle w:val="VerbatimChar"/>
+        </w:rPr>
+        <w:t xml:space="preserve">α + β + γ + δ + ε = 1.0</w:t>
+      </w:r>
+      <w:r>
+        <w:br/>
+      </w:r>
+      <w:r>
+        <w:rPr>
+          <w:rStyle w:val="VerbatimChar"/>
+        </w:rPr>
+        <w:t xml:space="preserve">0.30 + 0.20 + 0.25 + 0.15 + 0.10 = 1.00 ✓</w:t>
+      </w:r>
+    </w:p>
+    <w:p>
+      <w:pPr>
+        <w:pStyle w:val="FirstParagraph"/>
+      </w:pPr>
+      <w:r>
+        <w:t xml:space="preserve">This is not a convention. It is a mathematical requirement for the scores to be meaningful.</w:t>
+      </w:r>
+    </w:p>
+    <w:bookmarkEnd w:id="87"/>
+    <w:bookmarkStart w:id="88" w:name="why-1.0-is-required"/>
+    <w:p>
+      <w:pPr>
+        <w:pStyle w:val="Heading3"/>
+      </w:pPr>
+      <w:r>
+        <w:t xml:space="preserve">6.2 Why 1.0 Is Required</w:t>
+      </w:r>
+    </w:p>
+    <w:p>
+      <w:pPr>
+        <w:pStyle w:val="FirstParagraph"/>
+      </w:pPr>
+      <w:r>
+        <w:t xml:space="preserve">Every component is clamped to [0, 1]. When weights sum to exactly 1.0:</w:t>
+      </w:r>
+    </w:p>
+    <w:p>
+      <w:pPr>
+        <w:numPr>
+          <w:ilvl w:val="0"/>
+          <w:numId w:val="1019"/>
+        </w:numPr>
+        <w:pStyle w:val="Compact"/>
+      </w:pPr>
+      <w:r>
+        <w:t xml:space="preserve">The</w:t>
+      </w:r>
+      <w:r>
+        <w:t xml:space="preserve"> </w:t>
+      </w:r>
+      <w:r>
+        <w:rPr>
+          <w:bCs/>
+          <w:b/>
+        </w:rPr>
+        <w:t xml:space="preserve">best possible region</w:t>
+      </w:r>
+      <w:r>
+        <w:t xml:space="preserve"> </w:t>
+      </w:r>
+      <w:r>
+        <w:t xml:space="preserve">(all components = 1.0) scores exactly</w:t>
+      </w:r>
+      <w:r>
+        <w:t xml:space="preserve"> </w:t>
+      </w:r>
+      <w:r>
+        <w:rPr>
+          <w:bCs/>
+          <w:b/>
+        </w:rPr>
+        <w:t xml:space="preserve">1.0</w:t>
+      </w:r>
+      <w:r>
+        <w:t xml:space="preserve">.</w:t>
+      </w:r>
+    </w:p>
+    <w:p>
+      <w:pPr>
+        <w:numPr>
+          <w:ilvl w:val="0"/>
+          <w:numId w:val="1019"/>
+        </w:numPr>
+        <w:pStyle w:val="Compact"/>
+      </w:pPr>
+      <w:r>
+        <w:t xml:space="preserve">The</w:t>
+      </w:r>
+      <w:r>
+        <w:t xml:space="preserve"> </w:t>
+      </w:r>
+      <w:r>
+        <w:rPr>
+          <w:bCs/>
+          <w:b/>
+        </w:rPr>
+        <w:t xml:space="preserve">worst possible region</w:t>
+      </w:r>
+      <w:r>
+        <w:t xml:space="preserve"> </w:t>
+      </w:r>
+      <w:r>
+        <w:t xml:space="preserve">(all components = 0.0) scores exactly</w:t>
+      </w:r>
+      <w:r>
+        <w:t xml:space="preserve"> </w:t>
+      </w:r>
+      <w:r>
+        <w:rPr>
+          <w:bCs/>
+          <w:b/>
+        </w:rPr>
+        <w:t xml:space="preserve">0.0</w:t>
+      </w:r>
+      <w:r>
+        <w:t xml:space="preserve">.</w:t>
+      </w:r>
+    </w:p>
+    <w:p>
+      <w:pPr>
+        <w:numPr>
+          <w:ilvl w:val="0"/>
+          <w:numId w:val="1019"/>
+        </w:numPr>
+        <w:pStyle w:val="Compact"/>
+      </w:pPr>
+      <w:r>
+        <w:t xml:space="preserve">Every real region scores</w:t>
+      </w:r>
+      <w:r>
+        <w:t xml:space="preserve"> </w:t>
+      </w:r>
+      <w:r>
+        <w:rPr>
+          <w:bCs/>
+          <w:b/>
+        </w:rPr>
+        <w:t xml:space="preserve">somewhere between 0 and 1</w:t>
+      </w:r>
+      <w:r>
+        <w:t xml:space="preserve">.</w:t>
+      </w:r>
+    </w:p>
+    <w:p>
+      <w:pPr>
+        <w:numPr>
+          <w:ilvl w:val="0"/>
+          <w:numId w:val="1019"/>
+        </w:numPr>
+        <w:pStyle w:val="Compact"/>
+      </w:pPr>
+      <w:r>
+        <w:t xml:space="preserve">Scores from different regions are</w:t>
+      </w:r>
+      <w:r>
+        <w:t xml:space="preserve"> </w:t>
+      </w:r>
+      <w:r>
+        <w:rPr>
+          <w:bCs/>
+          <w:b/>
+        </w:rPr>
+        <w:t xml:space="preserve">directly comparable</w:t>
+      </w:r>
+      <w:r>
+        <w:t xml:space="preserve">: 0.75 is always better than 0.60, in</w:t>
+      </w:r>
+      <w:r>
+        <w:t xml:space="preserve"> </w:t>
+      </w:r>
+      <w:r>
+        <w:t xml:space="preserve">every run, under every policy version.</w:t>
+      </w:r>
+    </w:p>
+    <w:bookmarkEnd w:id="88"/>
+    <w:bookmarkStart w:id="89" w:name="X4e64c371e360098977ce2c86b94bd959b08a421"/>
+    <w:p>
+      <w:pPr>
+        <w:pStyle w:val="Heading3"/>
+      </w:pPr>
+      <w:r>
+        <w:t xml:space="preserve">6.3 What Breaks When the Weights Don’t Sum to 1.0</w:t>
+      </w:r>
+    </w:p>
+    <w:p>
+      <w:pPr>
+        <w:pStyle w:val="FirstParagraph"/>
+      </w:pPr>
+      <w:r>
+        <w:rPr>
+          <w:bCs/>
+          <w:b/>
+        </w:rPr>
+        <w:t xml:space="preserve">If weights sum to more than 1.0 (e.g., 1.10):</w:t>
+      </w:r>
+    </w:p>
+    <w:p>
+      <w:pPr>
+        <w:pStyle w:val="BodyText"/>
+      </w:pPr>
+      <w:r>
+        <w:t xml:space="preserve">The best possible score inflates above 1.0. A region with all perfect components scores 1.10 instead</w:t>
+      </w:r>
+      <w:r>
+        <w:t xml:space="preserve"> </w:t>
+      </w:r>
+      <w:r>
+        <w:t xml:space="preserve">of 1.0. Any downstream threshold calibrated against a [0, 1] range — for example,</w:t>
+      </w:r>
+      <w:r>
+        <w:t xml:space="preserve"> </w:t>
+      </w:r>
+      <w:r>
+        <w:t xml:space="preserve">“</w:t>
+      </w:r>
+      <w:r>
+        <w:t xml:space="preserve">do not place in</w:t>
+      </w:r>
+      <w:r>
+        <w:t xml:space="preserve"> </w:t>
+      </w:r>
+      <w:r>
+        <w:t xml:space="preserve">any region scoring below 0.60</w:t>
+      </w:r>
+      <w:r>
+        <w:t xml:space="preserve">”</w:t>
+      </w:r>
+      <w:r>
+        <w:t xml:space="preserve"> </w:t>
+      </w:r>
+      <w:r>
+        <w:t xml:space="preserve">— is now calibrated incorrectly. A mediocre region may clear the</w:t>
+      </w:r>
+      <w:r>
+        <w:t xml:space="preserve"> </w:t>
+      </w:r>
+      <w:r>
+        <w:t xml:space="preserve">threshold simply because scores are inflated.</w:t>
+      </w:r>
+    </w:p>
+    <w:p>
+      <w:pPr>
+        <w:pStyle w:val="BodyText"/>
+      </w:pPr>
+      <w:r>
+        <w:rPr>
+          <w:bCs/>
+          <w:b/>
+        </w:rPr>
+        <w:t xml:space="preserve">If weights sum to less than 1.0 (e.g., 0.90):</w:t>
+      </w:r>
+    </w:p>
+    <w:p>
+      <w:pPr>
+        <w:pStyle w:val="BodyText"/>
+      </w:pPr>
+      <w:r>
+        <w:t xml:space="preserve">All scores are uniformly compressed into [0, 0.90]. A region with all perfect components scores 0.90</w:t>
+      </w:r>
+      <w:r>
+        <w:t xml:space="preserve"> </w:t>
+      </w:r>
+      <w:r>
+        <w:t xml:space="preserve">instead of 1.0. A region that should score 0.67 now scores 0.60. Threshold gates calibrated against</w:t>
+      </w:r>
+      <w:r>
+        <w:t xml:space="preserve"> </w:t>
+      </w:r>
+      <w:r>
+        <w:t xml:space="preserve">[0, 1] now behave incorrectly in the other direction — some deployments are incorrectly blocked.</w:t>
+      </w:r>
+    </w:p>
+    <w:p>
+      <w:pPr>
+        <w:pStyle w:val="BodyText"/>
+      </w:pPr>
+      <w:r>
+        <w:t xml:space="preserve">Cross-policy comparisons also break: if one version had weights summing to 1.0 and the next has them</w:t>
+      </w:r>
+      <w:r>
+        <w:t xml:space="preserve"> </w:t>
+      </w:r>
+      <w:r>
+        <w:t xml:space="preserve">summing to 0.90, a score of 0.65 means something different under each version. Historical score</w:t>
+      </w:r>
+      <w:r>
+        <w:t xml:space="preserve"> </w:t>
+      </w:r>
+      <w:r>
+        <w:t xml:space="preserve">trend data becomes uninterpretable.</w:t>
+      </w:r>
+    </w:p>
+    <w:bookmarkEnd w:id="89"/>
+    <w:bookmarkStart w:id="90" w:name="tuning-the-weights-the-pie-rule"/>
+    <w:p>
+      <w:pPr>
+        <w:pStyle w:val="Heading3"/>
+      </w:pPr>
+      <w:r>
+        <w:t xml:space="preserve">6.4 Tuning the Weights — The Pie Rule</w:t>
+      </w:r>
+    </w:p>
+    <w:p>
+      <w:pPr>
+        <w:pStyle w:val="FirstParagraph"/>
+      </w:pPr>
+      <w:r>
+        <w:t xml:space="preserve">Think of the five weights as slices of a pie. The total pie is always exactly 100%. If one slice</w:t>
+      </w:r>
+      <w:r>
+        <w:t xml:space="preserve"> </w:t>
+      </w:r>
+      <w:r>
+        <w:t xml:space="preserve">grows, the others must shrink by the same total amount.</w:t>
+      </w:r>
+    </w:p>
+    <w:p>
+      <w:pPr>
+        <w:pStyle w:val="BodyText"/>
+      </w:pPr>
+      <w:r>
+        <w:rPr>
+          <w:bCs/>
+          <w:b/>
+        </w:rPr>
+        <w:t xml:space="preserve">Example — increasing headroom importance:</w:t>
+      </w:r>
+    </w:p>
+    <w:p>
+      <w:pPr>
+        <w:pStyle w:val="SourceCode"/>
+      </w:pPr>
+      <w:r>
+        <w:rPr>
+          <w:rStyle w:val="VerbatimChar"/>
+        </w:rPr>
+        <w:t xml:space="preserve">Before: α=0.30, β=0.20, γ=0.25, δ=0.15, ε=0.10  → sum = 1.00 ✓</w:t>
+      </w:r>
+      <w:r>
+        <w:br/>
+      </w:r>
+      <w:r>
+        <w:rPr>
+          <w:rStyle w:val="VerbatimChar"/>
+        </w:rPr>
+        <w:t xml:space="preserve">After:  α=0.40, β=0.15, γ=0.25, δ=0.10, ε=0.10  → sum = 1.00 ✓ (took 0.05 from β, 0.05 from δ)</w:t>
+      </w:r>
+      <w:r>
+        <w:br/>
+      </w:r>
+      <w:r>
+        <w:rPr>
+          <w:rStyle w:val="VerbatimChar"/>
+        </w:rPr>
+        <w:t xml:space="preserve">Wrong:  α=0.40, β=0.20, γ=0.25, δ=0.15, ε=0.10  → sum = 1.10 ✗ (forgot to reduce)</w:t>
+      </w:r>
+    </w:p>
+    <w:bookmarkEnd w:id="90"/>
+    <w:bookmarkStart w:id="91" w:name="X3da3bddaac74590e2583a245330c6c3bc498c02"/>
+    <w:p>
+      <w:pPr>
+        <w:pStyle w:val="Heading3"/>
+      </w:pPr>
+      <w:r>
+        <w:t xml:space="preserve">6.5 Validation Requirement — The Policy Load Gate</w:t>
+      </w:r>
+    </w:p>
+    <w:p>
+      <w:pPr>
+        <w:pStyle w:val="FirstParagraph"/>
+      </w:pPr>
+      <w:r>
+        <w:t xml:space="preserve">The Config/Scope-File Service</w:t>
+      </w:r>
+      <w:r>
+        <w:t xml:space="preserve"> </w:t>
+      </w:r>
+      <w:r>
+        <w:rPr>
+          <w:bCs/>
+          <w:b/>
+        </w:rPr>
+        <w:t xml:space="preserve">must</w:t>
+      </w:r>
+      <w:r>
+        <w:t xml:space="preserve"> </w:t>
+      </w:r>
+      <w:r>
+        <w:t xml:space="preserve">validate the weight sum every time a new PlacementPolicy</w:t>
+      </w:r>
+      <w:r>
+        <w:t xml:space="preserve"> </w:t>
+      </w:r>
+      <w:r>
+        <w:t xml:space="preserve">version is loaded. This validation must occur</w:t>
+      </w:r>
+      <w:r>
+        <w:t xml:space="preserve"> </w:t>
+      </w:r>
+      <w:r>
+        <w:rPr>
+          <w:bCs/>
+          <w:b/>
+        </w:rPr>
+        <w:t xml:space="preserve">before</w:t>
+      </w:r>
+      <w:r>
+        <w:t xml:space="preserve"> </w:t>
+      </w:r>
+      <w:r>
+        <w:t xml:space="preserve">the policy version is published to the</w:t>
+      </w:r>
+      <w:r>
+        <w:t xml:space="preserve"> </w:t>
+      </w:r>
+      <w:r>
+        <w:t xml:space="preserve">placement engine. A policy that fails this check must be rejected with a recorded configuration</w:t>
+      </w:r>
+      <w:r>
+        <w:t xml:space="preserve"> </w:t>
+      </w:r>
+      <w:r>
+        <w:t xml:space="preserve">error; the placement engine must never receive a policy with an invalid weight sum.</w:t>
+      </w:r>
+    </w:p>
+    <w:p>
+      <w:pPr>
+        <w:pStyle w:val="BodyText"/>
+      </w:pPr>
+      <w:r>
+        <w:t xml:space="preserve">See Section 6 of the Calculation Logic Reference and Section 8.2 of the Technical Design Document for the</w:t>
+      </w:r>
+      <w:r>
+        <w:t xml:space="preserve"> </w:t>
+      </w:r>
+      <w:r>
+        <w:t xml:space="preserve">formal validation rule specification.</w:t>
+      </w:r>
+    </w:p>
+    <w:p>
+      <w:r>
+        <w:pict>
+          <v:rect style="width:0;height:1.5pt" o:hralign="center" o:hrstd="t" o:hr="t"/>
+        </w:pict>
+      </w:r>
+    </w:p>
+    <w:bookmarkEnd w:id="91"/>
+    <w:bookmarkEnd w:id="92"/>
+    <w:bookmarkStart w:id="93" w:name="how-the-three-domains-connect"/>
+    <w:p>
+      <w:pPr>
+        <w:pStyle w:val="Heading2"/>
+      </w:pPr>
+      <w:r>
+        <w:t xml:space="preserve">7. How the Three Domains Connect</w:t>
+      </w:r>
+    </w:p>
+    <w:p>
+      <w:pPr>
+        <w:pStyle w:val="FirstParagraph"/>
+      </w:pPr>
+      <w:r>
+        <w:t xml:space="preserve">The three domains are not independent. They feed into each other:</w:t>
+      </w:r>
+    </w:p>
+    <w:p>
+      <w:pPr>
+        <w:pStyle w:val="SourceCode"/>
+      </w:pPr>
+      <w:r>
+        <w:rPr>
+          <w:rStyle w:val="VerbatimChar"/>
+        </w:rPr>
+        <w:t xml:space="preserve">Region Selection → Quota Management → Capacity Management</w:t>
+      </w:r>
+      <w:r>
+        <w:br/>
+      </w:r>
+      <w:r>
+        <w:rPr>
+          <w:rStyle w:val="VerbatimChar"/>
+        </w:rPr>
+        <w:t xml:space="preserve">       ↑                  ↑                    ↑</w:t>
+      </w:r>
+      <w:r>
+        <w:br/>
+      </w:r>
+      <w:r>
+        <w:rPr>
+          <w:rStyle w:val="VerbatimChar"/>
+        </w:rPr>
+        <w:t xml:space="preserve">  Uses quota scores   Uses CRG quantities   Uses placement output</w:t>
+      </w:r>
+      <w:r>
+        <w:br/>
+      </w:r>
+      <w:r>
+        <w:rPr>
+          <w:rStyle w:val="VerbatimChar"/>
+        </w:rPr>
+        <w:t xml:space="preserve">  as β component      to size pool limit    to set CRG targets</w:t>
+      </w:r>
+    </w:p>
+    <w:p>
+      <w:pPr>
+        <w:pStyle w:val="FirstParagraph"/>
+      </w:pPr>
+      <w:r>
+        <w:rPr>
+          <w:bCs/>
+          <w:b/>
+        </w:rPr>
+        <w:t xml:space="preserve">Flow for a new customer deployment:</w:t>
+      </w:r>
+    </w:p>
+    <w:p>
+      <w:pPr>
+        <w:numPr>
+          <w:ilvl w:val="0"/>
+          <w:numId w:val="1020"/>
+        </w:numPr>
+      </w:pPr>
+      <w:r>
+        <w:rPr>
+          <w:bCs/>
+          <w:b/>
+        </w:rPr>
+        <w:t xml:space="preserve">Region Selection</w:t>
+      </w:r>
+      <w:r>
+        <w:t xml:space="preserve"> </w:t>
+      </w:r>
+      <w:r>
+        <w:t xml:space="preserve">scores all candidate regions and picks the best Prod anchor. The quota</w:t>
+      </w:r>
+      <w:r>
+        <w:t xml:space="preserve"> </w:t>
+      </w:r>
+      <w:r>
+        <w:t xml:space="preserve">score (β component) uses current quota headroom from Domain 2. The capacity/headroom score</w:t>
+      </w:r>
+      <w:r>
+        <w:t xml:space="preserve"> </w:t>
+      </w:r>
+      <w:r>
+        <w:t xml:space="preserve">(α component) uses current CRG free slots from Domain 3.</w:t>
+      </w:r>
+    </w:p>
+    <w:p>
+      <w:pPr>
+        <w:numPr>
+          <w:ilvl w:val="0"/>
+          <w:numId w:val="1020"/>
+        </w:numPr>
+      </w:pPr>
+      <w:r>
+        <w:rPr>
+          <w:bCs/>
+          <w:b/>
+        </w:rPr>
+        <w:t xml:space="preserve">Quota Management</w:t>
+      </w:r>
+      <w:r>
+        <w:t xml:space="preserve"> </w:t>
+      </w:r>
+      <w:r>
+        <w:t xml:space="preserve">checks that the subscription in the selected region has enough quota limit</w:t>
+      </w:r>
+      <w:r>
+        <w:t xml:space="preserve"> </w:t>
+      </w:r>
+      <w:r>
+        <w:t xml:space="preserve">to accept the new deployment (Scenario 19, gate 7). If not, the deployment is blocked with</w:t>
+      </w:r>
+      <w:r>
+        <w:t xml:space="preserve"> </w:t>
+      </w:r>
+      <w:r>
+        <w:rPr>
+          <w:rStyle w:val="VerbatimChar"/>
+        </w:rPr>
+        <w:t xml:space="preserve">QUOTA_DEFICIT</w:t>
+      </w:r>
+      <w:r>
+        <w:t xml:space="preserve"> </w:t>
+      </w:r>
+      <w:r>
+        <w:t xml:space="preserve">until a quota increase request to Microsoft is approved.</w:t>
+      </w:r>
+    </w:p>
+    <w:p>
+      <w:pPr>
+        <w:numPr>
+          <w:ilvl w:val="0"/>
+          <w:numId w:val="1020"/>
+        </w:numPr>
+      </w:pPr>
+      <w:r>
+        <w:rPr>
+          <w:bCs/>
+          <w:b/>
+        </w:rPr>
+        <w:t xml:space="preserve">Capacity Management</w:t>
+      </w:r>
+      <w:r>
+        <w:t xml:space="preserve"> </w:t>
+      </w:r>
+      <w:r>
+        <w:t xml:space="preserve">checks that a Capacity Reservation exists and has enough quantity for</w:t>
+      </w:r>
+      <w:r>
+        <w:t xml:space="preserve"> </w:t>
+      </w:r>
+      <w:r>
+        <w:t xml:space="preserve">the deployment (Scenario 19, gate 6). If not, the deployment is blocked with</w:t>
+      </w:r>
+      <w:r>
+        <w:t xml:space="preserve"> </w:t>
+      </w:r>
+      <w:r>
+        <w:rPr>
+          <w:rStyle w:val="VerbatimChar"/>
+        </w:rPr>
+        <w:t xml:space="preserve">RESERVATION_DEFICIT</w:t>
+      </w:r>
+      <w:r>
+        <w:t xml:space="preserve"> </w:t>
+      </w:r>
+      <w:r>
+        <w:t xml:space="preserve">until the CRG is expanded.</w:t>
+      </w:r>
+    </w:p>
+    <w:p>
+      <w:pPr>
+        <w:pStyle w:val="FirstParagraph"/>
+      </w:pPr>
+      <w:r>
+        <w:t xml:space="preserve">Only when all three domains return green does the readiness gate emit</w:t>
+      </w:r>
+      <w:r>
+        <w:t xml:space="preserve"> </w:t>
+      </w:r>
+      <w:r>
+        <w:rPr>
+          <w:rStyle w:val="VerbatimChar"/>
+        </w:rPr>
+        <w:t xml:space="preserve">READY</w:t>
+      </w:r>
+      <w:r>
+        <w:t xml:space="preserve"> </w:t>
+      </w:r>
+      <w:r>
+        <w:t xml:space="preserve">and allow the</w:t>
+      </w:r>
+      <w:r>
+        <w:t xml:space="preserve"> </w:t>
+      </w:r>
+      <w:r>
+        <w:t xml:space="preserve">deployment to proceed.</w:t>
+      </w:r>
+    </w:p>
+    <w:p>
+      <w:pPr>
+        <w:pStyle w:val="BodyText"/>
+      </w:pPr>
+      <w:r>
+        <w:rPr>
+          <w:bCs/>
+          <w:b/>
+        </w:rPr>
+        <w:t xml:space="preserve">Flow for a DR event:</w:t>
+      </w:r>
+    </w:p>
+    <w:p>
+      <w:pPr>
+        <w:numPr>
+          <w:ilvl w:val="0"/>
+          <w:numId w:val="1021"/>
+        </w:numPr>
+        <w:pStyle w:val="Compact"/>
+      </w:pPr>
+      <w:r>
+        <w:t xml:space="preserve">The engine transitions to</w:t>
+      </w:r>
+      <w:r>
+        <w:t xml:space="preserve"> </w:t>
+      </w:r>
+      <w:r>
+        <w:rPr>
+          <w:rStyle w:val="VerbatimChar"/>
+        </w:rPr>
+        <w:t xml:space="preserve">DR_EVENT_ACTIVE</w:t>
+      </w:r>
+      <w:r>
+        <w:t xml:space="preserve">.</w:t>
+      </w:r>
+    </w:p>
+    <w:p>
+      <w:pPr>
+        <w:numPr>
+          <w:ilvl w:val="0"/>
+          <w:numId w:val="1021"/>
+        </w:numPr>
+        <w:pStyle w:val="Compact"/>
+      </w:pPr>
+      <w:r>
+        <w:t xml:space="preserve">The DR Orchestrator consults the SourceDestinationDRIndex to identify which standby VMs need</w:t>
+      </w:r>
+      <w:r>
+        <w:t xml:space="preserve"> </w:t>
+      </w:r>
+      <w:r>
+        <w:t xml:space="preserve">to be activated and where.</w:t>
+      </w:r>
+    </w:p>
+    <w:p>
+      <w:pPr>
+        <w:numPr>
+          <w:ilvl w:val="0"/>
+          <w:numId w:val="1021"/>
+        </w:numPr>
+        <w:pStyle w:val="Compact"/>
+      </w:pPr>
+      <w:r>
+        <w:rPr>
+          <w:bCs/>
+          <w:b/>
+        </w:rPr>
+        <w:t xml:space="preserve">Capacity Management</w:t>
+      </w:r>
+      <w:r>
+        <w:t xml:space="preserve"> </w:t>
+      </w:r>
+      <w:r>
+        <w:t xml:space="preserve">begins staged activation (Scenario 18): bootstrap headroom first, then</w:t>
+      </w:r>
+      <w:r>
+        <w:t xml:space="preserve"> </w:t>
+      </w:r>
+      <w:r>
+        <w:t xml:space="preserve">CRG expansion if needed, then CVAL release, then quota draw.</w:t>
+      </w:r>
+    </w:p>
+    <w:p>
+      <w:pPr>
+        <w:numPr>
+          <w:ilvl w:val="0"/>
+          <w:numId w:val="1021"/>
+        </w:numPr>
+        <w:pStyle w:val="Compact"/>
+      </w:pPr>
+      <w:r>
+        <w:rPr>
+          <w:bCs/>
+          <w:b/>
+        </w:rPr>
+        <w:t xml:space="preserve">Quota Management</w:t>
+      </w:r>
+      <w:r>
+        <w:t xml:space="preserve"> </w:t>
+      </w:r>
+      <w:r>
+        <w:t xml:space="preserve">confirms the shared pool has headroom for the DR draw (single-pool model:</w:t>
+      </w:r>
+      <w:r>
+        <w:t xml:space="preserve"> </w:t>
+      </w:r>
+      <w:r>
+        <w:t xml:space="preserve">no cross-group transfer needed — the DR earmark is already inside the pool).</w:t>
+      </w:r>
+    </w:p>
+    <w:p>
+      <w:pPr>
+        <w:numPr>
+          <w:ilvl w:val="0"/>
+          <w:numId w:val="1021"/>
+        </w:numPr>
+        <w:pStyle w:val="Compact"/>
+      </w:pPr>
+      <w:r>
+        <w:rPr>
+          <w:bCs/>
+          <w:b/>
+        </w:rPr>
+        <w:t xml:space="preserve">Region Selection</w:t>
+      </w:r>
+      <w:r>
+        <w:t xml:space="preserve"> </w:t>
+      </w:r>
+      <w:r>
+        <w:t xml:space="preserve">is not re-run — the Customer Seed Record is authoritative. Failback</w:t>
+      </w:r>
+      <w:r>
+        <w:t xml:space="preserve"> </w:t>
+      </w:r>
+      <w:r>
+        <w:t xml:space="preserve">restores the original seed without re-derivation.</w:t>
+      </w:r>
+    </w:p>
+    <w:p>
+      <w:r>
+        <w:pict>
+          <v:rect style="width:0;height:1.5pt" o:hralign="center" o:hrstd="t" o:hr="t"/>
+        </w:pict>
+      </w:r>
+    </w:p>
+    <w:bookmarkEnd w:id="93"/>
+    <w:bookmarkStart w:id="103" w:name="quick-reference-key-numbers"/>
+    <w:p>
+      <w:pPr>
+        <w:pStyle w:val="Heading2"/>
+      </w:pPr>
+      <w:r>
         <w:t xml:space="preserve">8. Quick Reference — Key Numbers</w:t>
       </w:r>
     </w:p>
-    <w:bookmarkStart w:id="94" w:name="configurable-parameters-reference"/>
+    <w:bookmarkStart w:id="101" w:name="configurable-parameters-reference"/>
     <w:p>
       <w:pPr>
         <w:pStyle w:val="Heading3"/>
@@ -15526,7 +16771,7 @@
         <w:t xml:space="preserve">baseline defaults, and how they’re configured.</w:t>
       </w:r>
     </w:p>
-    <w:bookmarkStart w:id="87" w:name="region-selection-scoring-weights"/>
+    <w:bookmarkStart w:id="94" w:name="region-selection-scoring-weights"/>
     <w:p>
       <w:pPr>
         <w:pStyle w:val="Heading4"/>
@@ -16134,8 +17379,8 @@
         <w:t xml:space="preserve">config file → Config/Scope-File Service validates at load time → if valid, policy is published. See Section 3.8 for tuning guidance.</w:t>
       </w:r>
     </w:p>
-    <w:bookmarkEnd w:id="87"/>
-    <w:bookmarkStart w:id="88" w:name="Xa77bf194eda09fc5c0bfc560bf2b14480ac8877"/>
+    <w:bookmarkEnd w:id="94"/>
+    <w:bookmarkStart w:id="95" w:name="Xa77bf194eda09fc5c0bfc560bf2b14480ac8877"/>
     <w:p>
       <w:pPr>
         <w:pStyle w:val="Heading4"/>
@@ -16646,8 +17891,8 @@
         <w:t xml:space="preserve">config file → no validation gate required (arbitrary values permitted). Changes take effect on next policy load.</w:t>
       </w:r>
     </w:p>
-    <w:bookmarkEnd w:id="88"/>
-    <w:bookmarkStart w:id="89" w:name="X148e20b46f283beddd5f06cf6dc77580552f21e"/>
+    <w:bookmarkEnd w:id="95"/>
+    <w:bookmarkStart w:id="96" w:name="X148e20b46f283beddd5f06cf6dc77580552f21e"/>
     <w:p>
       <w:pPr>
         <w:pStyle w:val="Heading4"/>
@@ -17306,8 +18551,8 @@
         <w:t xml:space="preserve">config file → no validation gate required. Changes take effect on next policy load. See Section 5.4 for auto-increase threshold tuning guidance.</w:t>
       </w:r>
     </w:p>
-    <w:bookmarkEnd w:id="89"/>
-    <w:bookmarkStart w:id="90" w:name="capacity-management-forecast-alerts"/>
+    <w:bookmarkEnd w:id="96"/>
+    <w:bookmarkStart w:id="97" w:name="capacity-management-forecast-alerts"/>
     <w:p>
       <w:pPr>
         <w:pStyle w:val="Heading4"/>
@@ -17623,8 +18868,8 @@
         <w:t xml:space="preserve">config file or forecast service config → changes take effect on next policy load or forecast run.</w:t>
       </w:r>
     </w:p>
-    <w:bookmarkEnd w:id="90"/>
-    <w:bookmarkStart w:id="91" w:name="dr-management-bootstrap-targets"/>
+    <w:bookmarkEnd w:id="97"/>
+    <w:bookmarkStart w:id="98" w:name="dr-management-bootstrap-targets"/>
     <w:p>
       <w:pPr>
         <w:pStyle w:val="Heading4"/>
@@ -17887,8 +19132,8 @@
         <w:t xml:space="preserve">config file → no validation gate required. DR bootstrap cannot be implicitly zero (ENV-006) — zero requires explicit approved policy exception.</w:t>
       </w:r>
     </w:p>
-    <w:bookmarkEnd w:id="91"/>
-    <w:bookmarkStart w:id="92" w:name="fixed-system-constants-not-configurable"/>
+    <w:bookmarkEnd w:id="98"/>
+    <w:bookmarkStart w:id="99" w:name="fixed-system-constants-not-configurable"/>
     <w:p>
       <w:pPr>
         <w:pStyle w:val="Heading4"/>
@@ -18140,8 +19385,8 @@
         </w:tc>
       </w:tr>
     </w:tbl>
-    <w:bookmarkEnd w:id="92"/>
-    <w:bookmarkStart w:id="93" w:name="configuration-change-process"/>
+    <w:bookmarkEnd w:id="99"/>
+    <w:bookmarkStart w:id="100" w:name="configuration-change-process"/>
     <w:p>
       <w:pPr>
         <w:pStyle w:val="Heading4"/>
@@ -18166,7 +19411,7 @@
       <w:pPr>
         <w:numPr>
           <w:ilvl w:val="0"/>
-          <w:numId w:val="1017"/>
+          <w:numId w:val="1022"/>
         </w:numPr>
         <w:pStyle w:val="Compact"/>
       </w:pPr>
@@ -18217,7 +19462,7 @@
       <w:pPr>
         <w:numPr>
           <w:ilvl w:val="0"/>
-          <w:numId w:val="1017"/>
+          <w:numId w:val="1022"/>
         </w:numPr>
         <w:pStyle w:val="Compact"/>
       </w:pPr>
@@ -18239,7 +19484,7 @@
       <w:pPr>
         <w:numPr>
           <w:ilvl w:val="0"/>
-          <w:numId w:val="1017"/>
+          <w:numId w:val="1022"/>
         </w:numPr>
         <w:pStyle w:val="Compact"/>
       </w:pPr>
@@ -18261,7 +19506,7 @@
       <w:pPr>
         <w:numPr>
           <w:ilvl w:val="0"/>
-          <w:numId w:val="1017"/>
+          <w:numId w:val="1022"/>
         </w:numPr>
         <w:pStyle w:val="Compact"/>
       </w:pPr>
@@ -18298,7 +19543,7 @@
       <w:pPr>
         <w:numPr>
           <w:ilvl w:val="0"/>
-          <w:numId w:val="1017"/>
+          <w:numId w:val="1022"/>
         </w:numPr>
         <w:pStyle w:val="Compact"/>
       </w:pPr>
@@ -18403,9 +19648,9 @@
         <w:t xml:space="preserve">config file to the previous version and republish.</w:t>
       </w:r>
     </w:p>
-    <w:bookmarkEnd w:id="93"/>
-    <w:bookmarkEnd w:id="94"/>
-    <w:bookmarkStart w:id="95" w:name="quick-reference-all-key-numbers"/>
+    <w:bookmarkEnd w:id="100"/>
+    <w:bookmarkEnd w:id="101"/>
+    <w:bookmarkStart w:id="102" w:name="quick-reference-all-key-numbers"/>
     <w:p>
       <w:pPr>
         <w:pStyle w:val="Heading3"/>
@@ -19610,7 +20855,7 @@
           <w:iCs/>
           <w:i/>
         </w:rPr>
-        <w:t xml:space="preserve">Document version 1.0 — 2 September 2026.</w:t>
+        <w:t xml:space="preserve">Document version 1.1 — reconciled to Requirements Baseline v2.4 (7 September 2026); originally 2 September 2026.</w:t>
       </w:r>
       <w:r>
         <w:t xml:space="preserve"> </w:t>
@@ -19620,7 +20865,7 @@
           <w:iCs/>
           <w:i/>
         </w:rPr>
-        <w:t xml:space="preserve">Source: ACRME Q&amp;A design walkthrough session, Calculation Logic Reference v2.2, Requirements</w:t>
+        <w:t xml:space="preserve">Source: ACRME Q&amp;A design walkthrough session, Calculation Logic Reference, Requirements</w:t>
       </w:r>
       <w:r>
         <w:rPr>
@@ -19634,7 +20879,7 @@
           <w:iCs/>
           <w:i/>
         </w:rPr>
-        <w:t xml:space="preserve">Baseline v2.2.</w:t>
+        <w:t xml:space="preserve">Baseline v2.4.</w:t>
       </w:r>
       <w:r>
         <w:t xml:space="preserve"> </w:t>
@@ -19661,9 +20906,9 @@
         <w:t xml:space="preserve">are available.</w:t>
       </w:r>
     </w:p>
-    <w:bookmarkEnd w:id="95"/>
-    <w:bookmarkEnd w:id="96"/>
-    <w:bookmarkEnd w:id="97"/>
+    <w:bookmarkEnd w:id="102"/>
+    <w:bookmarkEnd w:id="103"/>
+    <w:bookmarkEnd w:id="104"/>
     <w:sectPr/>
   </w:body>
 </w:document>
@@ -19925,6 +21170,91 @@
     <w:lvl w:ilvl="8">
       <w:numFmt w:val="bullet"/>
       <w:lvlText w:val="•"/>
+      <w:lvlJc w:val="left"/>
+      <w:pPr>
+        <w:ind w:left="6480" w:hanging="480"/>
+      </w:pPr>
+    </w:lvl>
+  </w:abstractNum>
+  <w:abstractNum w:abstractNumId="99511009">
+    <w:nsid w:val="A99511009"/>
+    <w:multiLevelType w:val="multilevel"/>
+    <w:lvl w:ilvl="0">
+      <w:start w:val="1009"/>
+      <w:numFmt w:val="lowerRoman"/>
+      <w:lvlText w:val="%1."/>
+      <w:lvlJc w:val="left"/>
+      <w:pPr>
+        <w:ind w:left="720" w:hanging="480"/>
+      </w:pPr>
+    </w:lvl>
+    <w:lvl w:ilvl="1">
+      <w:start w:val="1009"/>
+      <w:numFmt w:val="lowerRoman"/>
+      <w:lvlText w:val="%2."/>
+      <w:lvlJc w:val="left"/>
+      <w:pPr>
+        <w:ind w:left="1440" w:hanging="480"/>
+      </w:pPr>
+    </w:lvl>
+    <w:lvl w:ilvl="2">
+      <w:start w:val="1009"/>
+      <w:numFmt w:val="lowerRoman"/>
+      <w:lvlText w:val="%3."/>
+      <w:lvlJc w:val="left"/>
+      <w:pPr>
+        <w:ind w:left="2160" w:hanging="480"/>
+      </w:pPr>
+    </w:lvl>
+    <w:lvl w:ilvl="3">
+      <w:start w:val="1009"/>
+      <w:numFmt w:val="lowerRoman"/>
+      <w:lvlText w:val="%4."/>
+      <w:lvlJc w:val="left"/>
+      <w:pPr>
+        <w:ind w:left="2880" w:hanging="480"/>
+      </w:pPr>
+    </w:lvl>
+    <w:lvl w:ilvl="4">
+      <w:start w:val="1009"/>
+      <w:numFmt w:val="lowerRoman"/>
+      <w:lvlText w:val="%5."/>
+      <w:lvlJc w:val="left"/>
+      <w:pPr>
+        <w:ind w:left="3600" w:hanging="480"/>
+      </w:pPr>
+    </w:lvl>
+    <w:lvl w:ilvl="5">
+      <w:start w:val="1009"/>
+      <w:numFmt w:val="lowerRoman"/>
+      <w:lvlText w:val="%6."/>
+      <w:lvlJc w:val="left"/>
+      <w:pPr>
+        <w:ind w:left="4320" w:hanging="480"/>
+      </w:pPr>
+    </w:lvl>
+    <w:lvl w:ilvl="6">
+      <w:start w:val="1009"/>
+      <w:numFmt w:val="lowerRoman"/>
+      <w:lvlText w:val="%7."/>
+      <w:lvlJc w:val="left"/>
+      <w:pPr>
+        <w:ind w:left="5040" w:hanging="480"/>
+      </w:pPr>
+    </w:lvl>
+    <w:lvl w:ilvl="7">
+      <w:start w:val="1009"/>
+      <w:numFmt w:val="lowerRoman"/>
+      <w:lvlText w:val="%8."/>
+      <w:lvlJc w:val="left"/>
+      <w:pPr>
+        <w:ind w:left="5760" w:hanging="480"/>
+      </w:pPr>
+    </w:lvl>
+    <w:lvl w:ilvl="8">
+      <w:start w:val="1009"/>
+      <w:numFmt w:val="lowerRoman"/>
+      <w:lvlText w:val="%9."/>
       <w:lvlJc w:val="left"/>
       <w:pPr>
         <w:ind w:left="6480" w:hanging="480"/>
@@ -20058,6 +21388,48 @@
     <w:abstractNumId w:val="991"/>
   </w:num>
   <w:num w:numId="1015">
+    <w:abstractNumId w:val="99511009"/>
+    <w:lvlOverride w:ilvl="0">
+      <w:startOverride w:val="1009"/>
+    </w:lvlOverride>
+    <w:lvlOverride w:ilvl="1">
+      <w:startOverride w:val="1009"/>
+    </w:lvlOverride>
+    <w:lvlOverride w:ilvl="2">
+      <w:startOverride w:val="1009"/>
+    </w:lvlOverride>
+    <w:lvlOverride w:ilvl="3">
+      <w:startOverride w:val="1009"/>
+    </w:lvlOverride>
+    <w:lvlOverride w:ilvl="4">
+      <w:startOverride w:val="1009"/>
+    </w:lvlOverride>
+    <w:lvlOverride w:ilvl="5">
+      <w:startOverride w:val="1009"/>
+    </w:lvlOverride>
+    <w:lvlOverride w:ilvl="6">
+      <w:startOverride w:val="1009"/>
+    </w:lvlOverride>
+    <w:lvlOverride w:ilvl="7">
+      <w:startOverride w:val="1009"/>
+    </w:lvlOverride>
+    <w:lvlOverride w:ilvl="8">
+      <w:startOverride w:val="1009"/>
+    </w:lvlOverride>
+  </w:num>
+  <w:num w:numId="1016">
+    <w:abstractNumId w:val="991"/>
+  </w:num>
+  <w:num w:numId="1017">
+    <w:abstractNumId w:val="991"/>
+  </w:num>
+  <w:num w:numId="1018">
+    <w:abstractNumId w:val="991"/>
+  </w:num>
+  <w:num w:numId="1019">
+    <w:abstractNumId w:val="991"/>
+  </w:num>
+  <w:num w:numId="1020">
     <w:abstractNumId w:val="99411"/>
     <w:lvlOverride w:ilvl="0">
       <w:startOverride w:val="1"/>
@@ -20087,7 +21459,7 @@
       <w:startOverride w:val="1"/>
     </w:lvlOverride>
   </w:num>
-  <w:num w:numId="1016">
+  <w:num w:numId="1021">
     <w:abstractNumId w:val="99411"/>
     <w:lvlOverride w:ilvl="0">
       <w:startOverride w:val="1"/>
@@ -20117,7 +21489,7 @@
       <w:startOverride w:val="1"/>
     </w:lvlOverride>
   </w:num>
-  <w:num w:numId="1017">
+  <w:num w:numId="1022">
     <w:abstractNumId w:val="99411"/>
     <w:lvlOverride w:ilvl="0">
       <w:startOverride w:val="1"/>

</xml_diff>